<commit_message>
updates through 2025 - quarto site reporting data
</commit_message>
<xml_diff>
--- a/docs/index.docx
+++ b/docs/index.docx
@@ -15,7 +15,18 @@
         <w:pStyle w:val="Subtitle"/>
       </w:pPr>
       <w:r>
-        <w:t xml:space="preserve">Noxious Weeds Monitoring 2025-2026 LORP Workplan</w:t>
+        <w:t xml:space="preserve">Noxious Weeds Monitoring — LORP FY 2026–27 (</w:t>
+      </w:r>
+      <w:hyperlink r:id="rId20">
+        <w:r>
+          <w:rPr>
+            <w:rStyle w:val="Hyperlink"/>
+          </w:rPr>
+          <w:t xml:space="preserve">approved workplan PDF</w:t>
+        </w:r>
+      </w:hyperlink>
+      <w:r>
+        <w:t xml:space="preserve">)</w:t>
       </w:r>
     </w:p>
     <w:p>
@@ -23,7 +34,7 @@
         <w:pStyle w:val="Date"/>
       </w:pPr>
       <w:r>
-        <w:t xml:space="preserve">2025-09-18</w:t>
+        <w:t xml:space="preserve">2026-07-10</w:t>
       </w:r>
     </w:p>
     <w:sdt>
@@ -52,7 +63,7 @@
         </w:p>
       </w:sdtContent>
     </w:sdt>
-    <w:bookmarkStart w:id="24" w:name="summary"/>
+    <w:bookmarkStart w:id="25" w:name="summary"/>
     <w:p>
       <w:pPr>
         <w:pStyle w:val="Titre1"/>
@@ -87,7 +98,7 @@
       <w:r>
         <w:t xml:space="preserve"> </w:t>
       </w:r>
-      <w:hyperlink r:id="rId20">
+      <w:hyperlink r:id="rId21">
         <w:r>
           <w:rPr>
             <w:rStyle w:val="Hyperlink"/>
@@ -118,7 +129,7 @@
       <w:r>
         <w:t xml:space="preserve"> </w:t>
       </w:r>
-      <w:hyperlink r:id="rId21">
+      <w:hyperlink r:id="rId22">
         <w:r>
           <w:rPr>
             <w:rStyle w:val="Hyperlink"/>
@@ -195,7 +206,7 @@
         <w:t xml:space="preserve">- Filtered dataset now contains 1647 observations</w:t>
       </w:r>
     </w:p>
-    <w:bookmarkStart w:id="22" w:name="data-overview"/>
+    <w:bookmarkStart w:id="23" w:name="data-overview"/>
     <w:p>
       <w:pPr>
         <w:pStyle w:val="Titre2"/>
@@ -212,8 +223,8 @@
         <w:t xml:space="preserve">The dataset includes 1647 total observations across 8 years, with peak survey activity in 2025 (426 records).</w:t>
       </w:r>
     </w:p>
-    <w:bookmarkEnd w:id="22"/>
-    <w:bookmarkStart w:id="23" w:name="key-findings-summary"/>
+    <w:bookmarkEnd w:id="23"/>
+    <w:bookmarkStart w:id="24" w:name="key-findings-summary"/>
     <w:p>
       <w:pPr>
         <w:pStyle w:val="Titre2"/>
@@ -317,9 +328,9 @@
         <w:t xml:space="preserve">: 100% of records have complete date information (using observation date with creation date fallback)</w:t>
       </w:r>
     </w:p>
-    <w:bookmarkEnd w:id="23"/>
     <w:bookmarkEnd w:id="24"/>
-    <w:bookmarkStart w:id="36" w:name="interactive-map-comparison"/>
+    <w:bookmarkEnd w:id="25"/>
+    <w:bookmarkStart w:id="37" w:name="interactive-map-comparison"/>
     <w:p>
       <w:pPr>
         <w:pStyle w:val="Titre1"/>
@@ -334,6 +345,56 @@
       </w:pPr>
       <w:r>
         <w:t xml:space="preserve">The following interactive map shows pepperweed populations across all years (2018-2025). Use the layer controls in the top-right corner to toggle between different years. The map includes all 1647 documented observations, with feature creation dates used when observation dates are unavailable.</w:t>
+      </w:r>
+    </w:p>
+    <w:p>
+      <w:pPr>
+        <w:pStyle w:val="BodyText"/>
+      </w:pPr>
+      <w:r>
+        <w:rPr>
+          <w:b/>
+          <w:bCs/>
+        </w:rPr>
+        <w:t xml:space="preserve">Map layers:</w:t>
+      </w:r>
+      <w:r>
+        <w:t xml:space="preserve"> </w:t>
+      </w:r>
+      <w:r>
+        <w:t xml:space="preserve">purple</w:t>
+      </w:r>
+      <w:r>
+        <w:t xml:space="preserve"> </w:t>
+      </w:r>
+      <w:r>
+        <w:rPr>
+          <w:b/>
+          <w:bCs/>
+        </w:rPr>
+        <w:t xml:space="preserve">River channels</w:t>
+      </w:r>
+      <w:r>
+        <w:t xml:space="preserve"> </w:t>
+      </w:r>
+      <w:r>
+        <w:t xml:space="preserve">(multithreaded Owens River) and blue</w:t>
+      </w:r>
+      <w:r>
+        <w:t xml:space="preserve"> </w:t>
+      </w:r>
+      <w:r>
+        <w:rPr>
+          <w:b/>
+          <w:bCs/>
+        </w:rPr>
+        <w:t xml:space="preserve">High-water line</w:t>
+      </w:r>
+      <w:r>
+        <w:t xml:space="preserve"> </w:t>
+      </w:r>
+      <w:r>
+        <w:t xml:space="preserve">(June 2023 floodplain). Survey-gap polygons are deferred for now — use the tabular monitoring recommendations below.</w:t>
       </w:r>
     </w:p>
     <w:p>
@@ -449,18 +510,18 @@
           <wp:inline>
             <wp:extent cx="5753100" cy="4602480"/>
             <wp:effectExtent b="0" l="0" r="0" t="0"/>
-            <wp:docPr descr="" title="" id="26" name="Picture"/>
+            <wp:docPr descr="" title="" id="27" name="Picture"/>
             <a:graphic>
               <a:graphicData uri="http://schemas.openxmlformats.org/drawingml/2006/picture">
                 <pic:pic>
                   <pic:nvPicPr>
-                    <pic:cNvPr descr="index_files/figure-docx/interactive-map-1.png" id="27" name="Picture"/>
+                    <pic:cNvPr descr="index_files/figure-docx/interactive-map-1.png" id="28" name="Picture"/>
                     <pic:cNvPicPr>
                       <a:picLocks noChangeArrowheads="1" noChangeAspect="1"/>
                     </pic:cNvPicPr>
                   </pic:nvPicPr>
                   <pic:blipFill>
-                    <a:blip r:embed="rId25"/>
+                    <a:blip r:embed="rId26"/>
                     <a:stretch>
                       <a:fillRect/>
                     </a:stretch>
@@ -487,7 +548,7 @@
         </w:drawing>
       </w:r>
     </w:p>
-    <w:bookmarkStart w:id="35" w:name="Xd40d32226b991a08ba3c97a575220c73c46cde8"/>
+    <w:bookmarkStart w:id="36" w:name="Xd40d32226b991a08ba3c97a575220c73c46cde8"/>
     <w:p>
       <w:pPr>
         <w:pStyle w:val="Titre2"/>
@@ -501,7 +562,41 @@
         <w:pStyle w:val="FirstParagraph"/>
       </w:pPr>
       <w:r>
-        <w:t xml:space="preserve">The following histogram shows the distribution of abundance values for all pepperweed point locations documented in 2025:</w:t>
+        <w:t xml:space="preserve">Field abundance is recorded in discrete estimate classes (</w:t>
+      </w:r>
+      <w:r>
+        <w:rPr>
+          <w:b/>
+          <w:bCs/>
+        </w:rPr>
+        <w:t xml:space="preserve">5, 15, 25, 100, 200</w:t>
+      </w:r>
+      <w:r>
+        <w:t xml:space="preserve">). A value of</w:t>
+      </w:r>
+      <w:r>
+        <w:t xml:space="preserve"> </w:t>
+      </w:r>
+      <w:r>
+        <w:rPr>
+          <w:b/>
+          <w:bCs/>
+        </w:rPr>
+        <w:t xml:space="preserve">200 means ≥200 plants</w:t>
+      </w:r>
+      <w:r>
+        <w:t xml:space="preserve"> </w:t>
+      </w:r>
+      <w:r>
+        <w:t xml:space="preserve">— a lower bound for dense stands that may contain hundreds to thousands of individuals (not an exact count of 200).</w:t>
+      </w:r>
+    </w:p>
+    <w:p>
+      <w:pPr>
+        <w:pStyle w:val="BodyText"/>
+      </w:pPr>
+      <w:r>
+        <w:t xml:space="preserve">The following chart shows the distribution of these abundance classes for pepperweed sites documented in 2025:</w:t>
       </w:r>
     </w:p>
     <w:p>
@@ -513,18 +608,18 @@
           <wp:inline>
             <wp:extent cx="5753100" cy="4602480"/>
             <wp:effectExtent b="0" l="0" r="0" t="0"/>
-            <wp:docPr descr="" title="" id="29" name="Picture"/>
+            <wp:docPr descr="" title="" id="30" name="Picture"/>
             <a:graphic>
               <a:graphicData uri="http://schemas.openxmlformats.org/drawingml/2006/picture">
                 <pic:pic>
                   <pic:nvPicPr>
-                    <pic:cNvPr descr="index_files/figure-docx/abundance-histogram-1.png" id="30" name="Picture"/>
+                    <pic:cNvPr descr="index_files/figure-docx/abundance-histogram-1.png" id="31" name="Picture"/>
                     <pic:cNvPicPr>
                       <a:picLocks noChangeArrowheads="1" noChangeAspect="1"/>
                     </pic:cNvPicPr>
                   </pic:nvPicPr>
                   <pic:blipFill>
-                    <a:blip r:embed="rId28"/>
+                    <a:blip r:embed="rId29"/>
                     <a:stretch>
                       <a:fillRect/>
                     </a:stretch>
@@ -577,16 +672,16 @@
         <w:rPr>
           <w:rStyle w:val="VerbatimChar"/>
         </w:rPr>
-        <w:t xml:space="preserve">- **Small Sites (≤ 100 plants)**: 325 sites ( 76.3 %)</w:t>
-      </w:r>
-      <w:r>
-        <w:br/>
-      </w:r>
-      <w:r>
-        <w:rPr>
-          <w:rStyle w:val="VerbatimChar"/>
-        </w:rPr>
-        <w:t xml:space="preserve">- **Large Sites (&gt; 100 plants)**: 99 sites ( 23.2 %)</w:t>
+        <w:t xml:space="preserve">- **Sites below 200 class**: 325 ( 76.3 %)</w:t>
+      </w:r>
+      <w:r>
+        <w:br/>
+      </w:r>
+      <w:r>
+        <w:rPr>
+          <w:rStyle w:val="VerbatimChar"/>
+        </w:rPr>
+        <w:t xml:space="preserve">- **Sites in 200+ class (≥200 plants; may be thousands)**: 99 ( 23.2 %)</w:t>
       </w:r>
       <w:r>
         <w:br/>
@@ -607,64 +702,73 @@
         <w:rPr>
           <w:rStyle w:val="VerbatimChar"/>
         </w:rPr>
-        <w:t xml:space="preserve">- **1 plants**: 57 sites</w:t>
-      </w:r>
-      <w:r>
-        <w:br/>
-      </w:r>
-      <w:r>
-        <w:rPr>
-          <w:rStyle w:val="VerbatimChar"/>
-        </w:rPr>
-        <w:t xml:space="preserve">- **2 plants**: 135 sites</w:t>
-      </w:r>
-      <w:r>
-        <w:br/>
-      </w:r>
-      <w:r>
-        <w:rPr>
-          <w:rStyle w:val="VerbatimChar"/>
-        </w:rPr>
-        <w:t xml:space="preserve">- **4 plants**: 133 sites</w:t>
-      </w:r>
-      <w:r>
-        <w:br/>
-      </w:r>
-      <w:r>
-        <w:rPr>
-          <w:rStyle w:val="VerbatimChar"/>
-        </w:rPr>
-        <w:t xml:space="preserve">- **5 plants**: 99 sites</w:t>
-      </w:r>
-      <w:r>
-        <w:br/>
-      </w:r>
-      <w:r>
-        <w:br/>
-      </w:r>
-      <w:r>
-        <w:rPr>
-          <w:rStyle w:val="VerbatimChar"/>
-        </w:rPr>
-        <w:t xml:space="preserve">### Abundance Range</w:t>
-      </w:r>
-      <w:r>
-        <w:br/>
-      </w:r>
-      <w:r>
-        <w:rPr>
-          <w:rStyle w:val="VerbatimChar"/>
-        </w:rPr>
-        <w:t xml:space="preserve">- **Minimum**: 5 plants</w:t>
-      </w:r>
-      <w:r>
-        <w:br/>
-      </w:r>
-      <w:r>
-        <w:rPr>
-          <w:rStyle w:val="VerbatimChar"/>
-        </w:rPr>
-        <w:t xml:space="preserve">- **Maximum**: 200 plants</w:t>
+        <w:t xml:space="preserve">- **5 plants (estimate class)**: 57 sites</w:t>
+      </w:r>
+      <w:r>
+        <w:br/>
+      </w:r>
+      <w:r>
+        <w:rPr>
+          <w:rStyle w:val="VerbatimChar"/>
+        </w:rPr>
+        <w:t xml:space="preserve">- **15 plants (estimate class)**: 59 sites</w:t>
+      </w:r>
+      <w:r>
+        <w:br/>
+      </w:r>
+      <w:r>
+        <w:rPr>
+          <w:rStyle w:val="VerbatimChar"/>
+        </w:rPr>
+        <w:t xml:space="preserve">- **25 plants (estimate class)**: 76 sites</w:t>
+      </w:r>
+      <w:r>
+        <w:br/>
+      </w:r>
+      <w:r>
+        <w:rPr>
+          <w:rStyle w:val="VerbatimChar"/>
+        </w:rPr>
+        <w:t xml:space="preserve">- **100 plants (estimate class)**: 133 sites</w:t>
+      </w:r>
+      <w:r>
+        <w:br/>
+      </w:r>
+      <w:r>
+        <w:rPr>
+          <w:rStyle w:val="VerbatimChar"/>
+        </w:rPr>
+        <w:t xml:space="preserve">- **200+ plants (≥200; may be thousands)**: 99 sites</w:t>
+      </w:r>
+      <w:r>
+        <w:br/>
+      </w:r>
+      <w:r>
+        <w:br/>
+      </w:r>
+      <w:r>
+        <w:rPr>
+          <w:rStyle w:val="VerbatimChar"/>
+        </w:rPr>
+        <w:t xml:space="preserve">### Abundance coding</w:t>
+      </w:r>
+      <w:r>
+        <w:br/>
+      </w:r>
+      <w:r>
+        <w:rPr>
+          <w:rStyle w:val="VerbatimChar"/>
+        </w:rPr>
+        <w:t xml:space="preserve">- Field classes used: **5, 15, 25, 100, 200**</w:t>
+      </w:r>
+      <w:r>
+        <w:br/>
+      </w:r>
+      <w:r>
+        <w:rPr>
+          <w:rStyle w:val="VerbatimChar"/>
+        </w:rPr>
+        <w:t xml:space="preserve">- **200 = 200 or more** — dense patches are not counted stem-by-stem and can represent thousands of individuals</w:t>
       </w:r>
     </w:p>
     <w:p>
@@ -675,7 +779,7 @@
         <w:t xml:space="preserve">The interactive map above provides the primary visualization of pepperweed distribution patterns.</w:t>
       </w:r>
     </w:p>
-    <w:bookmarkStart w:id="34" w:name="recent-sites"/>
+    <w:bookmarkStart w:id="35" w:name="recent-sites"/>
     <w:p>
       <w:pPr>
         <w:pStyle w:val="Titre3"/>
@@ -691,20 +795,20 @@
       <w:r>
         <w:drawing>
           <wp:inline>
-            <wp:extent cx="5753100" cy="17822624"/>
+            <wp:extent cx="5753100" cy="18583131"/>
             <wp:effectExtent b="0" l="0" r="0" t="0"/>
-            <wp:docPr descr="" title="" id="32" name="Picture"/>
+            <wp:docPr descr="" title="" id="33" name="Picture"/>
             <a:graphic>
               <a:graphicData uri="http://schemas.openxmlformats.org/drawingml/2006/picture">
                 <pic:pic>
                   <pic:nvPicPr>
-                    <pic:cNvPr descr="index_files/figure-docx/new-sites-1.png" id="33" name="Picture"/>
+                    <pic:cNvPr descr="index_files/figure-docx/new-sites-1.png" id="34" name="Picture"/>
                     <pic:cNvPicPr>
                       <a:picLocks noChangeArrowheads="1" noChangeAspect="1"/>
                     </pic:cNvPicPr>
                   </pic:nvPicPr>
                   <pic:blipFill>
-                    <a:blip r:embed="rId31"/>
+                    <a:blip r:embed="rId32"/>
                     <a:stretch>
                       <a:fillRect/>
                     </a:stretch>
@@ -712,7 +816,7 @@
                   <pic:spPr bwMode="auto">
                     <a:xfrm>
                       <a:off x="0" y="0"/>
-                      <a:ext cx="5753100" cy="17822624"/>
+                      <a:ext cx="5753100" cy="18583131"/>
                     </a:xfrm>
                     <a:prstGeom prst="rect">
                       <a:avLst/>
@@ -731,10 +835,10 @@
         </w:drawing>
       </w:r>
     </w:p>
-    <w:bookmarkEnd w:id="34"/>
     <w:bookmarkEnd w:id="35"/>
     <w:bookmarkEnd w:id="36"/>
-    <w:bookmarkStart w:id="39" w:name="data-quality-and-limitations"/>
+    <w:bookmarkEnd w:id="37"/>
+    <w:bookmarkStart w:id="40" w:name="data-quality-and-limitations"/>
     <w:p>
       <w:pPr>
         <w:pStyle w:val="Titre1"/>
@@ -743,7 +847,7 @@
         <w:t xml:space="preserve">3. Data Quality and Limitations</w:t>
       </w:r>
     </w:p>
-    <w:bookmarkStart w:id="37" w:name="data-sources"/>
+    <w:bookmarkStart w:id="38" w:name="data-sources"/>
     <w:p>
       <w:pPr>
         <w:pStyle w:val="Titre2"/>
@@ -772,7 +876,7 @@
       <w:r>
         <w:t xml:space="preserve"> </w:t>
       </w:r>
-      <w:hyperlink r:id="rId20">
+      <w:hyperlink r:id="rId21">
         <w:r>
           <w:rPr>
             <w:rStyle w:val="Hyperlink"/>
@@ -817,8 +921,8 @@
         <w:t xml:space="preserve">: WGS84 (EPSG:4326)</w:t>
       </w:r>
     </w:p>
-    <w:bookmarkEnd w:id="37"/>
-    <w:bookmarkStart w:id="38" w:name="limitations"/>
+    <w:bookmarkEnd w:id="38"/>
+    <w:bookmarkStart w:id="39" w:name="limitations"/>
     <w:p>
       <w:pPr>
         <w:pStyle w:val="Titre2"/>
@@ -872,18 +976,99 @@
         </w:numPr>
       </w:pPr>
       <w:r>
-        <w:t xml:space="preserve">Abundance categories are based on field estimates</w:t>
-      </w:r>
-    </w:p>
-    <w:bookmarkEnd w:id="38"/>
+        <w:t xml:space="preserve">Abundance is recorded in field estimate classes (</w:t>
+      </w:r>
+      <w:r>
+        <w:rPr>
+          <w:b/>
+          <w:bCs/>
+        </w:rPr>
+        <w:t xml:space="preserve">5, 15, 25, 100, 200</w:t>
+      </w:r>
+      <w:r>
+        <w:t xml:space="preserve">);</w:t>
+      </w:r>
+      <w:r>
+        <w:t xml:space="preserve"> </w:t>
+      </w:r>
+      <w:r>
+        <w:rPr>
+          <w:b/>
+          <w:bCs/>
+        </w:rPr>
+        <w:t xml:space="preserve">200 means ≥200 plants</w:t>
+      </w:r>
+      <w:r>
+        <w:t xml:space="preserve"> </w:t>
+      </w:r>
+      <w:r>
+        <w:t xml:space="preserve">and dense stands may contain thousands of individuals</w:t>
+      </w:r>
+    </w:p>
     <w:bookmarkEnd w:id="39"/>
-    <w:bookmarkStart w:id="43" w:name="river-reach-analysis"/>
+    <w:bookmarkEnd w:id="40"/>
+    <w:bookmarkStart w:id="44" w:name="river-reach-analysis"/>
     <w:p>
       <w:pPr>
         <w:pStyle w:val="Titre1"/>
       </w:pPr>
       <w:r>
         <w:t xml:space="preserve">4. River Reach Analysis</w:t>
+      </w:r>
+    </w:p>
+    <w:p>
+      <w:pPr>
+        <w:pStyle w:val="SourceCode"/>
+      </w:pPr>
+      <w:r>
+        <w:rPr>
+          <w:rStyle w:val="VerbatimChar"/>
+        </w:rPr>
+        <w:t xml:space="preserve">Number of river reaches loaded: 6 </w:t>
+      </w:r>
+    </w:p>
+    <w:p>
+      <w:pPr>
+        <w:pStyle w:val="SourceCode"/>
+      </w:pPr>
+      <w:r>
+        <w:rPr>
+          <w:rStyle w:val="VerbatimChar"/>
+        </w:rPr>
+        <w:t xml:space="preserve">Reach names: LORP Reach 1 LORP Reach 2 LORP Reach 3 LORP Reach 4 LORP Reach 5 LORP Reach 6 </w:t>
+      </w:r>
+    </w:p>
+    <w:p>
+      <w:pPr>
+        <w:pStyle w:val="SourceCode"/>
+      </w:pPr>
+      <w:r>
+        <w:rPr>
+          <w:rStyle w:val="VerbatimChar"/>
+        </w:rPr>
+        <w:t xml:space="preserve">Sites before filtering: 1647 </w:t>
+      </w:r>
+    </w:p>
+    <w:p>
+      <w:pPr>
+        <w:pStyle w:val="SourceCode"/>
+      </w:pPr>
+      <w:r>
+        <w:rPr>
+          <w:rStyle w:val="VerbatimChar"/>
+        </w:rPr>
+        <w:t xml:space="preserve">Sites after spatial join: 1647 </w:t>
+      </w:r>
+    </w:p>
+    <w:p>
+      <w:pPr>
+        <w:pStyle w:val="SourceCode"/>
+      </w:pPr>
+      <w:r>
+        <w:rPr>
+          <w:rStyle w:val="VerbatimChar"/>
+        </w:rPr>
+        <w:t xml:space="preserve">Sites with reach assignments: 1647 </w:t>
       </w:r>
     </w:p>
     <w:p>
@@ -893,20 +1078,20 @@
       <w:r>
         <w:drawing>
           <wp:inline>
-            <wp:extent cx="5753100" cy="3595687"/>
+            <wp:extent cx="5753100" cy="5393531"/>
             <wp:effectExtent b="0" l="0" r="0" t="0"/>
-            <wp:docPr descr="" title="" id="41" name="Picture"/>
+            <wp:docPr descr="" title="" id="42" name="Picture"/>
             <a:graphic>
               <a:graphicData uri="http://schemas.openxmlformats.org/drawingml/2006/picture">
                 <pic:pic>
                   <pic:nvPicPr>
-                    <pic:cNvPr descr="index_files/figure-docx/river-reach-analysis-1.png" id="42" name="Picture"/>
+                    <pic:cNvPr descr="index_files/figure-docx/river-reach-analysis-1.png" id="43" name="Picture"/>
                     <pic:cNvPicPr>
                       <a:picLocks noChangeArrowheads="1" noChangeAspect="1"/>
                     </pic:cNvPicPr>
                   </pic:nvPicPr>
                   <pic:blipFill>
-                    <a:blip r:embed="rId40"/>
+                    <a:blip r:embed="rId41"/>
                     <a:stretch>
                       <a:fillRect/>
                     </a:stretch>
@@ -914,7 +1099,7 @@
                   <pic:spPr bwMode="auto">
                     <a:xfrm>
                       <a:off x="0" y="0"/>
-                      <a:ext cx="5753100" cy="3595687"/>
+                      <a:ext cx="5753100" cy="5393531"/>
                     </a:xfrm>
                     <a:prstGeom prst="rect">
                       <a:avLst/>
@@ -989,34 +1174,34 @@
         <w:rPr>
           <w:rStyle w:val="VerbatimChar"/>
         </w:rPr>
-        <w:t xml:space="preserve">- ** LORP Reach 2 **: 567 sites</w:t>
-      </w:r>
-      <w:r>
-        <w:br/>
-      </w:r>
-      <w:r>
-        <w:rPr>
-          <w:rStyle w:val="VerbatimChar"/>
-        </w:rPr>
-        <w:t xml:space="preserve">- ** LORP Reach 3 **: 420 sites</w:t>
-      </w:r>
-      <w:r>
-        <w:br/>
-      </w:r>
-      <w:r>
-        <w:rPr>
-          <w:rStyle w:val="VerbatimChar"/>
-        </w:rPr>
-        <w:t xml:space="preserve">- ** LORP Reach 1 **: 162 sites</w:t>
-      </w:r>
-      <w:r>
-        <w:br/>
-      </w:r>
-      <w:r>
-        <w:rPr>
-          <w:rStyle w:val="VerbatimChar"/>
-        </w:rPr>
-        <w:t xml:space="preserve">- ** LORP Reach 4 **: 48 sites</w:t>
+        <w:t xml:space="preserve">- ** LORP Reach 2 **: 999 sites</w:t>
+      </w:r>
+      <w:r>
+        <w:br/>
+      </w:r>
+      <w:r>
+        <w:rPr>
+          <w:rStyle w:val="VerbatimChar"/>
+        </w:rPr>
+        <w:t xml:space="preserve">- ** LORP Reach 3 **: 423 sites</w:t>
+      </w:r>
+      <w:r>
+        <w:br/>
+      </w:r>
+      <w:r>
+        <w:rPr>
+          <w:rStyle w:val="VerbatimChar"/>
+        </w:rPr>
+        <w:t xml:space="preserve">- ** LORP Reach 1 **: 163 sites</w:t>
+      </w:r>
+      <w:r>
+        <w:br/>
+      </w:r>
+      <w:r>
+        <w:rPr>
+          <w:rStyle w:val="VerbatimChar"/>
+        </w:rPr>
+        <w:t xml:space="preserve">- ** LORP Reach 4 **: 47 sites</w:t>
       </w:r>
       <w:r>
         <w:br/>
@@ -1036,45 +1221,909 @@
         </w:rPr>
         <w:t xml:space="preserve">- ** LORP Reach 6 **: 3 sites</w:t>
       </w:r>
-      <w:r>
-        <w:br/>
-      </w:r>
-      <w:r>
-        <w:br/>
-      </w:r>
-      <w:r>
-        <w:rPr>
-          <w:rStyle w:val="VerbatimChar"/>
-        </w:rPr>
-        <w:t xml:space="preserve">### Sites Outside LORP Reaches</w:t>
-      </w:r>
-      <w:r>
-        <w:br/>
-      </w:r>
-      <w:r>
-        <w:rPr>
-          <w:rStyle w:val="VerbatimChar"/>
-        </w:rPr>
-        <w:t xml:space="preserve">- **Sites outside reach polygons**: 435 </w:t>
-      </w:r>
-      <w:r>
-        <w:br/>
-      </w:r>
-      <w:r>
-        <w:rPr>
-          <w:rStyle w:val="VerbatimChar"/>
-        </w:rPr>
-        <w:t xml:space="preserve">- **Percentage of total sites**: 26.4 %</w:t>
-      </w:r>
-    </w:p>
-    <w:bookmarkEnd w:id="43"/>
-    <w:bookmarkStart w:id="47" w:name="river-mile-analysis"/>
+    </w:p>
+    <w:bookmarkEnd w:id="44"/>
+    <w:bookmarkStart w:id="49" w:name="occupancy-analysis"/>
     <w:p>
       <w:pPr>
         <w:pStyle w:val="Titre1"/>
       </w:pPr>
       <w:r>
-        <w:t xml:space="preserve">5. River Mile Analysis</w:t>
+        <w:t xml:space="preserve">5. Occupancy Analysis</w:t>
+      </w:r>
+    </w:p>
+    <w:p>
+      <w:pPr>
+        <w:pStyle w:val="SourceCode"/>
+      </w:pPr>
+      <w:r>
+        <w:rPr>
+          <w:rStyle w:val="VerbatimChar"/>
+        </w:rPr>
+        <w:t xml:space="preserve">### Overall Occupancy Analysis</w:t>
+      </w:r>
+    </w:p>
+    <w:p>
+      <w:pPr>
+        <w:pStyle w:val="SourceCode"/>
+      </w:pPr>
+      <w:r>
+        <w:rPr>
+          <w:rStyle w:val="VerbatimChar"/>
+        </w:rPr>
+        <w:t xml:space="preserve">**Resolution**: 1/10 mile segments (600 total segments across 60 miles)</w:t>
+      </w:r>
+    </w:p>
+    <w:p>
+      <w:pPr>
+        <w:pStyle w:val="SourceCode"/>
+      </w:pPr>
+      <w:r>
+        <w:rPr>
+          <w:rStyle w:val="VerbatimChar"/>
+        </w:rPr>
+        <w:t xml:space="preserve">#### Overall Occupancy by Year</w:t>
+      </w:r>
+    </w:p>
+    <w:p>
+      <w:pPr>
+        <w:pStyle w:val="SourceCode"/>
+      </w:pPr>
+      <w:r>
+        <w:br/>
+      </w:r>
+      <w:r>
+        <w:br/>
+      </w:r>
+      <w:r>
+        <w:rPr>
+          <w:rStyle w:val="VerbatimChar"/>
+        </w:rPr>
+        <w:t xml:space="preserve">Table: Number of 1/10 mile segments occupied by pepperweed</w:t>
+      </w:r>
+      <w:r>
+        <w:br/>
+      </w:r>
+      <w:r>
+        <w:br/>
+      </w:r>
+      <w:r>
+        <w:rPr>
+          <w:rStyle w:val="VerbatimChar"/>
+        </w:rPr>
+        <w:t xml:space="preserve">| Year | Segments Occupied | Total Segments | Occupancy % |</w:t>
+      </w:r>
+      <w:r>
+        <w:br/>
+      </w:r>
+      <w:r>
+        <w:rPr>
+          <w:rStyle w:val="VerbatimChar"/>
+        </w:rPr>
+        <w:t xml:space="preserve">|:----:|:-----------------:|:--------------:|:-----------:|</w:t>
+      </w:r>
+      <w:r>
+        <w:br/>
+      </w:r>
+      <w:r>
+        <w:rPr>
+          <w:rStyle w:val="VerbatimChar"/>
+        </w:rPr>
+        <w:t xml:space="preserve">| 2018 |        15         |      600       |     2.5     |</w:t>
+      </w:r>
+      <w:r>
+        <w:br/>
+      </w:r>
+      <w:r>
+        <w:rPr>
+          <w:rStyle w:val="VerbatimChar"/>
+        </w:rPr>
+        <w:t xml:space="preserve">| 2019 |        74         |      600       |    12.3     |</w:t>
+      </w:r>
+      <w:r>
+        <w:br/>
+      </w:r>
+      <w:r>
+        <w:rPr>
+          <w:rStyle w:val="VerbatimChar"/>
+        </w:rPr>
+        <w:t xml:space="preserve">| 2020 |        86         |      600       |    14.3     |</w:t>
+      </w:r>
+      <w:r>
+        <w:br/>
+      </w:r>
+      <w:r>
+        <w:rPr>
+          <w:rStyle w:val="VerbatimChar"/>
+        </w:rPr>
+        <w:t xml:space="preserve">| 2021 |        21         |      600       |     3.5     |</w:t>
+      </w:r>
+      <w:r>
+        <w:br/>
+      </w:r>
+      <w:r>
+        <w:rPr>
+          <w:rStyle w:val="VerbatimChar"/>
+        </w:rPr>
+        <w:t xml:space="preserve">| 2022 |        37         |      600       |     6.2     |</w:t>
+      </w:r>
+      <w:r>
+        <w:br/>
+      </w:r>
+      <w:r>
+        <w:rPr>
+          <w:rStyle w:val="VerbatimChar"/>
+        </w:rPr>
+        <w:t xml:space="preserve">| 2023 |         1         |      600       |     0.2     |</w:t>
+      </w:r>
+      <w:r>
+        <w:br/>
+      </w:r>
+      <w:r>
+        <w:rPr>
+          <w:rStyle w:val="VerbatimChar"/>
+        </w:rPr>
+        <w:t xml:space="preserve">| 2024 |        87         |      600       |    14.5     |</w:t>
+      </w:r>
+      <w:r>
+        <w:br/>
+      </w:r>
+      <w:r>
+        <w:rPr>
+          <w:rStyle w:val="VerbatimChar"/>
+        </w:rPr>
+        <w:t xml:space="preserve">| 2025 |        145        |      600       |    24.2     |</w:t>
+      </w:r>
+    </w:p>
+    <w:p>
+      <w:pPr>
+        <w:pStyle w:val="SourceCode"/>
+      </w:pPr>
+      <w:r>
+        <w:br/>
+      </w:r>
+      <w:r>
+        <w:rPr>
+          <w:rStyle w:val="VerbatimChar"/>
+        </w:rPr>
+        <w:t xml:space="preserve">#### Reach-Specific Occupancy</w:t>
+      </w:r>
+    </w:p>
+    <w:p>
+      <w:pPr>
+        <w:pStyle w:val="SourceCode"/>
+      </w:pPr>
+      <w:r>
+        <w:br/>
+      </w:r>
+      <w:r>
+        <w:br/>
+      </w:r>
+      <w:r>
+        <w:rPr>
+          <w:rStyle w:val="VerbatimChar"/>
+        </w:rPr>
+        <w:t xml:space="preserve">Table: Percentage of each reach occupied by pepperweed (by year)</w:t>
+      </w:r>
+      <w:r>
+        <w:br/>
+      </w:r>
+      <w:r>
+        <w:br/>
+      </w:r>
+      <w:r>
+        <w:rPr>
+          <w:rStyle w:val="VerbatimChar"/>
+        </w:rPr>
+        <w:t xml:space="preserve">|LORP Reach   | 2018 | 2019 | 2020 | 2021 | 2022 | 2023 | 2024 | 2025 |</w:t>
+      </w:r>
+      <w:r>
+        <w:br/>
+      </w:r>
+      <w:r>
+        <w:rPr>
+          <w:rStyle w:val="VerbatimChar"/>
+        </w:rPr>
+        <w:t xml:space="preserve">|:------------|:----:|:----:|:----:|:----:|:----:|:----:|:----:|:----:|</w:t>
+      </w:r>
+      <w:r>
+        <w:br/>
+      </w:r>
+      <w:r>
+        <w:rPr>
+          <w:rStyle w:val="VerbatimChar"/>
+        </w:rPr>
+        <w:t xml:space="preserve">|LORP Reach 1 | 23.7 | 52.6 | 39.5 | 2.6  |  NA  |  NA  | 10.5 | 55.3 |</w:t>
+      </w:r>
+      <w:r>
+        <w:br/>
+      </w:r>
+      <w:r>
+        <w:rPr>
+          <w:rStyle w:val="VerbatimChar"/>
+        </w:rPr>
+        <w:t xml:space="preserve">|LORP Reach 2 | 3.1  | 17.6 | 23.9 | 5.0  | 15.7 |  NA  | 21.4 | 40.3 |</w:t>
+      </w:r>
+      <w:r>
+        <w:br/>
+      </w:r>
+      <w:r>
+        <w:rPr>
+          <w:rStyle w:val="VerbatimChar"/>
+        </w:rPr>
+        <w:t xml:space="preserve">|LORP Reach 3 | 0.7  | 17.6 | 20.3 | 5.4  | 7.4  | 0.7  | 29.1 | 31.8 |</w:t>
+      </w:r>
+      <w:r>
+        <w:br/>
+      </w:r>
+      <w:r>
+        <w:rPr>
+          <w:rStyle w:val="VerbatimChar"/>
+        </w:rPr>
+        <w:t xml:space="preserve">|LORP Reach 4 |  NA  |  NA  | 8.3  | 11.1 | 2.8  |  NA  | 19.4 | 11.1 |</w:t>
+      </w:r>
+      <w:r>
+        <w:br/>
+      </w:r>
+      <w:r>
+        <w:rPr>
+          <w:rStyle w:val="VerbatimChar"/>
+        </w:rPr>
+        <w:t xml:space="preserve">|LORP Reach 5 |  NA  |  NA  |  NA  |  NA  |  NA  |  NA  | 2.9  | 17.6 |</w:t>
+      </w:r>
+      <w:r>
+        <w:br/>
+      </w:r>
+      <w:r>
+        <w:rPr>
+          <w:rStyle w:val="VerbatimChar"/>
+        </w:rPr>
+        <w:t xml:space="preserve">|LORP Reach 6 |  NA  |  NA  |  NA  |  NA  |  NA  |  NA  |  NA  | 8.1  |</w:t>
+      </w:r>
+    </w:p>
+    <w:p>
+      <w:pPr>
+        <w:pStyle w:val="SourceCode"/>
+      </w:pPr>
+      <w:r>
+        <w:br/>
+      </w:r>
+      <w:r>
+        <w:rPr>
+          <w:rStyle w:val="VerbatimChar"/>
+        </w:rPr>
+        <w:t xml:space="preserve">### Occupancy Summary Statistics</w:t>
+      </w:r>
+    </w:p>
+    <w:p>
+      <w:pPr>
+        <w:pStyle w:val="SourceCode"/>
+      </w:pPr>
+      <w:r>
+        <w:rPr>
+          <w:rStyle w:val="VerbatimChar"/>
+        </w:rPr>
+        <w:t xml:space="preserve">**Average Annual Occupancy**: 9.7 %</w:t>
+      </w:r>
+    </w:p>
+    <w:p>
+      <w:pPr>
+        <w:pStyle w:val="SourceCode"/>
+      </w:pPr>
+      <w:r>
+        <w:rPr>
+          <w:rStyle w:val="VerbatimChar"/>
+        </w:rPr>
+        <w:t xml:space="preserve">**Highest Occupancy Year**: 2025 ( 24.2 %)</w:t>
+      </w:r>
+    </w:p>
+    <w:p>
+      <w:pPr>
+        <w:pStyle w:val="SourceCode"/>
+      </w:pPr>
+      <w:r>
+        <w:rPr>
+          <w:rStyle w:val="VerbatimChar"/>
+        </w:rPr>
+        <w:t xml:space="preserve">**Lowest Occupancy Year**: 2023 ( 0.2 %)</w:t>
+      </w:r>
+    </w:p>
+    <w:p>
+      <w:pPr>
+        <w:pStyle w:val="SourceCode"/>
+      </w:pPr>
+      <w:r>
+        <w:br/>
+      </w:r>
+      <w:r>
+        <w:rPr>
+          <w:rStyle w:val="VerbatimChar"/>
+        </w:rPr>
+        <w:t xml:space="preserve">**Most Occupied Reach**: LORP Reach 1 ( 30.7 % average)</w:t>
+      </w:r>
+    </w:p>
+    <w:p>
+      <w:pPr>
+        <w:pStyle w:val="SourceCode"/>
+      </w:pPr>
+      <w:r>
+        <w:rPr>
+          <w:rStyle w:val="VerbatimChar"/>
+        </w:rPr>
+        <w:t xml:space="preserve">**Least Occupied Reach**: LORP Reach 6 ( 8.1 % average)</w:t>
+      </w:r>
+    </w:p>
+    <w:bookmarkStart w:id="48" w:name="X0e199f324500ea33e403fc235205799c6e02c9f"/>
+    <w:p>
+      <w:pPr>
+        <w:pStyle w:val="Titre2"/>
+      </w:pPr>
+      <w:r>
+        <w:t xml:space="preserve">5.1 Cumulative Discovery and Occupancy Forecasts</w:t>
+      </w:r>
+    </w:p>
+    <w:p>
+      <w:pPr>
+        <w:pStyle w:val="FirstParagraph"/>
+      </w:pPr>
+      <w:r>
+        <w:t xml:space="preserve">Annual occupancy fluctuates with survey effort. A more informative metric for the</w:t>
+      </w:r>
+      <w:r>
+        <w:t xml:space="preserve"> </w:t>
+      </w:r>
+      <w:r>
+        <w:t xml:space="preserve">“more you look, the more you find”</w:t>
+      </w:r>
+      <w:r>
+        <w:t xml:space="preserve"> </w:t>
+      </w:r>
+      <w:r>
+        <w:t xml:space="preserve">pattern is</w:t>
+      </w:r>
+      <w:r>
+        <w:t xml:space="preserve"> </w:t>
+      </w:r>
+      <w:r>
+        <w:rPr>
+          <w:b/>
+          <w:bCs/>
+        </w:rPr>
+        <w:t xml:space="preserve">cumulative discovery</w:t>
+      </w:r>
+      <w:r>
+        <w:t xml:space="preserve">: the share of corridor segments that have ever had a detection. Pepperweed is already widespread on adjacent conveyances and upper-river reaches, so the planning question is when known occupancy along the LORP corridor approaches saturation.</w:t>
+      </w:r>
+    </w:p>
+    <w:p>
+      <w:pPr>
+        <w:pStyle w:val="SourceCode"/>
+      </w:pPr>
+      <w:r>
+        <w:rPr>
+          <w:rStyle w:val="VerbatimChar"/>
+        </w:rPr>
+        <w:t xml:space="preserve">### Cumulative Discovery by Year</w:t>
+      </w:r>
+    </w:p>
+    <w:p>
+      <w:pPr>
+        <w:pStyle w:val="SourceCode"/>
+      </w:pPr>
+      <w:r>
+        <w:rPr>
+          <w:rStyle w:val="VerbatimChar"/>
+        </w:rPr>
+        <w:t xml:space="preserve">Once a segment or river mile has a detection, it remains in the cumulative total. This isolates discovery/spread from year-to-year survey intensity.</w:t>
+      </w:r>
+    </w:p>
+    <w:p>
+      <w:pPr>
+        <w:pStyle w:val="SourceCode"/>
+      </w:pPr>
+      <w:r>
+        <w:br/>
+      </w:r>
+      <w:r>
+        <w:br/>
+      </w:r>
+      <w:r>
+        <w:rPr>
+          <w:rStyle w:val="VerbatimChar"/>
+        </w:rPr>
+        <w:t xml:space="preserve">Table: Cumulative pepperweed discovery along the LORP corridor (0.1-mi segments and whole river miles)</w:t>
+      </w:r>
+      <w:r>
+        <w:br/>
+      </w:r>
+      <w:r>
+        <w:br/>
+      </w:r>
+      <w:r>
+        <w:rPr>
+          <w:rStyle w:val="VerbatimChar"/>
+        </w:rPr>
+        <w:t xml:space="preserve">| Year | Segments Known | New Segments | Segment % | Miles Known | New Miles | Mile % |</w:t>
+      </w:r>
+      <w:r>
+        <w:br/>
+      </w:r>
+      <w:r>
+        <w:rPr>
+          <w:rStyle w:val="VerbatimChar"/>
+        </w:rPr>
+        <w:t xml:space="preserve">|:----:|:--------------:|:------------:|:---------:|:-----------:|:---------:|:------:|</w:t>
+      </w:r>
+      <w:r>
+        <w:br/>
+      </w:r>
+      <w:r>
+        <w:rPr>
+          <w:rStyle w:val="VerbatimChar"/>
+        </w:rPr>
+        <w:t xml:space="preserve">| 2018 |       15       |      15      |    2.5    |      8      |     8     |  13.1  |</w:t>
+      </w:r>
+      <w:r>
+        <w:br/>
+      </w:r>
+      <w:r>
+        <w:rPr>
+          <w:rStyle w:val="VerbatimChar"/>
+        </w:rPr>
+        <w:t xml:space="preserve">| 2019 |       75       |      60      |   12.5    |     18      |    10     |  29.5  |</w:t>
+      </w:r>
+      <w:r>
+        <w:br/>
+      </w:r>
+      <w:r>
+        <w:rPr>
+          <w:rStyle w:val="VerbatimChar"/>
+        </w:rPr>
+        <w:t xml:space="preserve">| 2020 |      100       |      25      |   16.7    |     22      |     4     |  36.1  |</w:t>
+      </w:r>
+      <w:r>
+        <w:br/>
+      </w:r>
+      <w:r>
+        <w:rPr>
+          <w:rStyle w:val="VerbatimChar"/>
+        </w:rPr>
+        <w:t xml:space="preserve">| 2021 |      107       |      7       |   17.8    |     25      |     3     |  41.0  |</w:t>
+      </w:r>
+      <w:r>
+        <w:br/>
+      </w:r>
+      <w:r>
+        <w:rPr>
+          <w:rStyle w:val="VerbatimChar"/>
+        </w:rPr>
+        <w:t xml:space="preserve">| 2022 |      127       |      20      |   21.2    |     29      |     4     |  47.5  |</w:t>
+      </w:r>
+      <w:r>
+        <w:br/>
+      </w:r>
+      <w:r>
+        <w:rPr>
+          <w:rStyle w:val="VerbatimChar"/>
+        </w:rPr>
+        <w:t xml:space="preserve">| 2023 |      128       |      1       |   21.3    |     30      |     1     |  49.2  |</w:t>
+      </w:r>
+      <w:r>
+        <w:br/>
+      </w:r>
+      <w:r>
+        <w:rPr>
+          <w:rStyle w:val="VerbatimChar"/>
+        </w:rPr>
+        <w:t xml:space="preserve">| 2024 |      159       |      31      |   26.5    |     35      |     5     |  57.4  |</w:t>
+      </w:r>
+      <w:r>
+        <w:br/>
+      </w:r>
+      <w:r>
+        <w:rPr>
+          <w:rStyle w:val="VerbatimChar"/>
+        </w:rPr>
+        <w:t xml:space="preserve">| 2025 |      204       |      45      |   34.0    |     44      |     9     |  72.1  |</w:t>
+      </w:r>
+    </w:p>
+    <w:p>
+      <w:pPr>
+        <w:pStyle w:val="SourceCode"/>
+      </w:pPr>
+      <w:r>
+        <w:br/>
+      </w:r>
+      <w:r>
+        <w:rPr>
+          <w:rStyle w:val="VerbatimChar"/>
+        </w:rPr>
+        <w:t xml:space="preserve">### Forecast to Corridor Saturation</w:t>
+      </w:r>
+    </w:p>
+    <w:p>
+      <w:pPr>
+        <w:pStyle w:val="SourceCode"/>
+      </w:pPr>
+      <w:r>
+        <w:rPr>
+          <w:rStyle w:val="VerbatimChar"/>
+        </w:rPr>
+        <w:t xml:space="preserve">Models fit to cumulative occupancy and projected forward:</w:t>
+      </w:r>
+    </w:p>
+    <w:p>
+      <w:pPr>
+        <w:pStyle w:val="SourceCode"/>
+      </w:pPr>
+      <w:r>
+        <w:rPr>
+          <w:rStyle w:val="VerbatimChar"/>
+        </w:rPr>
+        <w:t xml:space="preserve">- **Linear** — constant annual discovery rate; reaches 100% in finite time.</w:t>
+      </w:r>
+    </w:p>
+    <w:p>
+      <w:pPr>
+        <w:pStyle w:val="SourceCode"/>
+      </w:pPr>
+      <w:r>
+        <w:rPr>
+          <w:rStyle w:val="VerbatimChar"/>
+        </w:rPr>
+        <w:t xml:space="preserve">- **Asymptotic** — approaches 100% with diminishing returns (classic discovery / sampling plateau).</w:t>
+      </w:r>
+    </w:p>
+    <w:p>
+      <w:pPr>
+        <w:pStyle w:val="SourceCode"/>
+      </w:pPr>
+      <w:r>
+        <w:rPr>
+          <w:rStyle w:val="VerbatimChar"/>
+        </w:rPr>
+        <w:t xml:space="preserve">- **Logistic** — S-curve to a 100% carrying capacity; slows as unoccupied corridor shrinks.</w:t>
+      </w:r>
+    </w:p>
+    <w:p>
+      <w:pPr>
+        <w:pStyle w:val="SourceCode"/>
+      </w:pPr>
+      <w:r>
+        <w:rPr>
+          <w:rStyle w:val="VerbatimChar"/>
+        </w:rPr>
+        <w:t xml:space="preserve">- **Recent trajectory (whole miles)** — slope from the last two survey years only; tests the hypothesis that pepperweed is already more ubiquitous than the full-series fit implies, and limited annual effort is still revealing occupied miles quickly.</w:t>
+      </w:r>
+    </w:p>
+    <w:p>
+      <w:pPr>
+        <w:pStyle w:val="SourceCode"/>
+      </w:pPr>
+      <w:r>
+        <w:rPr>
+          <w:rStyle w:val="VerbatimChar"/>
+        </w:rPr>
+        <w:t xml:space="preserve">Pepperweed is already common on nearby ditches, streams, and upper-river reaches; these forecasts treat the LORP corridor as filling toward full known occupancy under continued survey and/or spread.</w:t>
+      </w:r>
+    </w:p>
+    <w:p>
+      <w:pPr>
+        <w:pStyle w:val="SourceCode"/>
+      </w:pPr>
+      <w:r>
+        <w:br/>
+      </w:r>
+      <w:r>
+        <w:br/>
+      </w:r>
+      <w:r>
+        <w:rPr>
+          <w:rStyle w:val="VerbatimChar"/>
+        </w:rPr>
+        <w:t xml:space="preserve">Table: Projected calendar year when cumulative occupancy reaches each milestone (fit to 2018–2025 discovery)</w:t>
+      </w:r>
+      <w:r>
+        <w:br/>
+      </w:r>
+      <w:r>
+        <w:br/>
+      </w:r>
+      <w:r>
+        <w:rPr>
+          <w:rStyle w:val="VerbatimChar"/>
+        </w:rPr>
+        <w:t xml:space="preserve">|Resolution        |Occupancy Milestone | Linear | Asymptotic | Logistic |</w:t>
+      </w:r>
+      <w:r>
+        <w:br/>
+      </w:r>
+      <w:r>
+        <w:rPr>
+          <w:rStyle w:val="VerbatimChar"/>
+        </w:rPr>
+        <w:t xml:space="preserve">|:-----------------|:-------------------|:------:|:----------:|:--------:|</w:t>
+      </w:r>
+      <w:r>
+        <w:br/>
+      </w:r>
+      <w:r>
+        <w:rPr>
+          <w:rStyle w:val="VerbatimChar"/>
+        </w:rPr>
+        <w:t xml:space="preserve">|0.1-mi segments   |50%                 | 2029.9 |   2032.0   |  2028.0  |</w:t>
+      </w:r>
+      <w:r>
+        <w:br/>
+      </w:r>
+      <w:r>
+        <w:rPr>
+          <w:rStyle w:val="VerbatimChar"/>
+        </w:rPr>
+        <w:t xml:space="preserve">|0.1-mi segments   |75%                 | 2036.8 |   2047.2   |  2032.7  |</w:t>
+      </w:r>
+      <w:r>
+        <w:br/>
+      </w:r>
+      <w:r>
+        <w:rPr>
+          <w:rStyle w:val="VerbatimChar"/>
+        </w:rPr>
+        <w:t xml:space="preserve">|0.1-mi segments   |90%                 | 2040.9 |   2067.4   |  2037.3  |</w:t>
+      </w:r>
+      <w:r>
+        <w:br/>
+      </w:r>
+      <w:r>
+        <w:rPr>
+          <w:rStyle w:val="VerbatimChar"/>
+        </w:rPr>
+        <w:t xml:space="preserve">|0.1-mi segments   |95%                 | 2042.2 |   2082.7   |  2040.5  |</w:t>
+      </w:r>
+      <w:r>
+        <w:br/>
+      </w:r>
+      <w:r>
+        <w:rPr>
+          <w:rStyle w:val="VerbatimChar"/>
+        </w:rPr>
+        <w:t xml:space="preserve">|0.1-mi segments   |99%                 | 2043.3 |   2118.1   |  2047.5  |</w:t>
+      </w:r>
+      <w:r>
+        <w:br/>
+      </w:r>
+      <w:r>
+        <w:rPr>
+          <w:rStyle w:val="VerbatimChar"/>
+        </w:rPr>
+        <w:t xml:space="preserve">|0.1-mi segments   |100% (linear only)  | 2043.6 |     NA     |    NA    |</w:t>
+      </w:r>
+      <w:r>
+        <w:br/>
+      </w:r>
+      <w:r>
+        <w:rPr>
+          <w:rStyle w:val="VerbatimChar"/>
+        </w:rPr>
+        <w:t xml:space="preserve">|Whole river miles |50%                 | 2022.4 |   2022.2   |  2022.5  |</w:t>
+      </w:r>
+      <w:r>
+        <w:br/>
+      </w:r>
+      <w:r>
+        <w:rPr>
+          <w:rStyle w:val="VerbatimChar"/>
+        </w:rPr>
+        <w:t xml:space="preserve">|Whole river miles |75%                 | 2026.0 |   2027.7   |  2026.1  |</w:t>
+      </w:r>
+      <w:r>
+        <w:br/>
+      </w:r>
+      <w:r>
+        <w:rPr>
+          <w:rStyle w:val="VerbatimChar"/>
+        </w:rPr>
+        <w:t xml:space="preserve">|Whole river miles |90%                 | 2028.1 |   2035.0   |  2029.8  |</w:t>
+      </w:r>
+      <w:r>
+        <w:br/>
+      </w:r>
+      <w:r>
+        <w:rPr>
+          <w:rStyle w:val="VerbatimChar"/>
+        </w:rPr>
+        <w:t xml:space="preserve">|Whole river miles |95%                 | 2028.8 |   2040.6   |  2032.2  |</w:t>
+      </w:r>
+      <w:r>
+        <w:br/>
+      </w:r>
+      <w:r>
+        <w:rPr>
+          <w:rStyle w:val="VerbatimChar"/>
+        </w:rPr>
+        <w:t xml:space="preserve">|Whole river miles |99%                 | 2029.3 |   2053.4   |  2037.7  |</w:t>
+      </w:r>
+      <w:r>
+        <w:br/>
+      </w:r>
+      <w:r>
+        <w:rPr>
+          <w:rStyle w:val="VerbatimChar"/>
+        </w:rPr>
+        <w:t xml:space="preserve">|Whole river miles |100% (linear only)  | 2029.5 |     NA     |    NA    |</w:t>
+      </w:r>
+    </w:p>
+    <w:p>
+      <w:pPr>
+        <w:pStyle w:val="SourceCode"/>
+      </w:pPr>
+      <w:r>
+        <w:br/>
+      </w:r>
+      <w:r>
+        <w:rPr>
+          <w:rStyle w:val="VerbatimChar"/>
+        </w:rPr>
+        <w:t xml:space="preserve">#### Infill lag (whole mile → 0.1-mi segment)</w:t>
+      </w:r>
+    </w:p>
+    <w:p>
+      <w:pPr>
+        <w:pStyle w:val="SourceCode"/>
+      </w:pPr>
+      <w:r>
+        <w:rPr>
+          <w:rStyle w:val="VerbatimChar"/>
+        </w:rPr>
+        <w:t xml:space="preserve">The **horizontal gap** between the blue (whole-mile) and red (0.1-mi) logistic curves is the years of additional discovery needed to occupy every subsegment once whole-mile occupancy has already reached that level.</w:t>
+      </w:r>
+    </w:p>
+    <w:p>
+      <w:pPr>
+        <w:pStyle w:val="SourceCode"/>
+      </w:pPr>
+      <w:r>
+        <w:br/>
+      </w:r>
+      <w:r>
+        <w:br/>
+      </w:r>
+      <w:r>
+        <w:rPr>
+          <w:rStyle w:val="VerbatimChar"/>
+        </w:rPr>
+        <w:t xml:space="preserve">Table: Time lag between whole-mile and subsegment occupancy (logistic forecasts)</w:t>
+      </w:r>
+      <w:r>
+        <w:br/>
+      </w:r>
+      <w:r>
+        <w:br/>
+      </w:r>
+      <w:r>
+        <w:rPr>
+          <w:rStyle w:val="VerbatimChar"/>
+        </w:rPr>
+        <w:t xml:space="preserve">| Occupancy level | Whole-mile year | 0.1-mi year | Lag (yr) |Interpretation                                        |</w:t>
+      </w:r>
+      <w:r>
+        <w:br/>
+      </w:r>
+      <w:r>
+        <w:rPr>
+          <w:rStyle w:val="VerbatimChar"/>
+        </w:rPr>
+        <w:t xml:space="preserve">|:---------------:|:---------------:|:-----------:|:--------:|:-----------------------------------------------------|</w:t>
+      </w:r>
+      <w:r>
+        <w:br/>
+      </w:r>
+      <w:r>
+        <w:rPr>
+          <w:rStyle w:val="VerbatimChar"/>
+        </w:rPr>
+        <w:t xml:space="preserve">|       50%       |     2022.5      |   2028.0    |   5.5    |~5.5 yr to fill 0.1-mi gaps after whole miles hit 50% |</w:t>
+      </w:r>
+      <w:r>
+        <w:br/>
+      </w:r>
+      <w:r>
+        <w:rPr>
+          <w:rStyle w:val="VerbatimChar"/>
+        </w:rPr>
+        <w:t xml:space="preserve">|       75%       |     2026.1      |   2032.7    |   6.6    |~6.6 yr to fill 0.1-mi gaps after whole miles hit 75% |</w:t>
+      </w:r>
+      <w:r>
+        <w:br/>
+      </w:r>
+      <w:r>
+        <w:rPr>
+          <w:rStyle w:val="VerbatimChar"/>
+        </w:rPr>
+        <w:t xml:space="preserve">|       90%       |     2029.8      |   2037.3    |   7.5    |~7.5 yr to fill 0.1-mi gaps after whole miles hit 90% |</w:t>
+      </w:r>
+    </w:p>
+    <w:p>
+      <w:pPr>
+        <w:pStyle w:val="SourceCode"/>
+      </w:pPr>
+      <w:r>
+        <w:br/>
+      </w:r>
+      <w:r>
+        <w:rPr>
+          <w:rStyle w:val="VerbatimChar"/>
+        </w:rPr>
+        <w:t xml:space="preserve">#### Model Fit Summary</w:t>
+      </w:r>
+    </w:p>
+    <w:p>
+      <w:pPr>
+        <w:pStyle w:val="SourceCode"/>
+      </w:pPr>
+      <w:r>
+        <w:rPr>
+          <w:rStyle w:val="VerbatimChar"/>
+        </w:rPr>
+        <w:t xml:space="preserve">- **Segment linear**: +3.7 percentage points/year → 100% in ~2044</w:t>
+      </w:r>
+    </w:p>
+    <w:p>
+      <w:pPr>
+        <w:pStyle w:val="SourceCode"/>
+      </w:pPr>
+      <w:r>
+        <w:rPr>
+          <w:rStyle w:val="VerbatimChar"/>
+        </w:rPr>
+        <w:t xml:space="preserve">- **Mile linear (full series)**: +7.1 percentage points/year → 100% in ~2029</w:t>
+      </w:r>
+    </w:p>
+    <w:p>
+      <w:pPr>
+        <w:pStyle w:val="SourceCode"/>
+      </w:pPr>
+      <w:r>
+        <w:rPr>
+          <w:rStyle w:val="VerbatimChar"/>
+        </w:rPr>
+        <w:t xml:space="preserve">- **Mile recent trajectory (last 2 yr)**: +11.5 percentage points/year → 100% in ~2028</w:t>
+      </w:r>
+    </w:p>
+    <w:p>
+      <w:pPr>
+        <w:pStyle w:val="SourceCode"/>
+      </w:pPr>
+      <w:r>
+        <w:rPr>
+          <w:rStyle w:val="VerbatimChar"/>
+        </w:rPr>
+        <w:t xml:space="preserve">- **Segment logistic**: midpoint (50%) ~2028; 95% ~2041</w:t>
+      </w:r>
+    </w:p>
+    <w:p>
+      <w:pPr>
+        <w:pStyle w:val="SourceCode"/>
+      </w:pPr>
+      <w:r>
+        <w:rPr>
+          <w:rStyle w:val="VerbatimChar"/>
+        </w:rPr>
+        <w:t xml:space="preserve">- **Mile logistic**: midpoint (50%) ~2022; 95% ~2032</w:t>
+      </w:r>
+    </w:p>
+    <w:p>
+      <w:pPr>
+        <w:pStyle w:val="SourceCode"/>
+      </w:pPr>
+      <w:r>
+        <w:br/>
+      </w:r>
+      <w:r>
+        <w:rPr>
+          <w:rStyle w:val="VerbatimChar"/>
+        </w:rPr>
+        <w:t xml:space="preserve">**Current cumulative occupancy (2025)**: 34.0% of 0.1-mi segments; 72.1% of whole river miles.</w:t>
       </w:r>
     </w:p>
     <w:p>
@@ -1084,20 +2133,669 @@
       <w:r>
         <w:drawing>
           <wp:inline>
-            <wp:extent cx="5753100" cy="4314825"/>
+            <wp:extent cx="5753100" cy="3355975"/>
             <wp:effectExtent b="0" l="0" r="0" t="0"/>
-            <wp:docPr descr="" title="" id="45" name="Picture"/>
+            <wp:docPr descr="" title="" id="46" name="Picture"/>
             <a:graphic>
               <a:graphicData uri="http://schemas.openxmlformats.org/drawingml/2006/picture">
                 <pic:pic>
                   <pic:nvPicPr>
-                    <pic:cNvPr descr="index_files/figure-docx/river-mile-analysis-1.png" id="46" name="Picture"/>
+                    <pic:cNvPr descr="index_files/figure-docx/occupancy-forecast-1.png" id="47" name="Picture"/>
                     <pic:cNvPicPr>
                       <a:picLocks noChangeArrowheads="1" noChangeAspect="1"/>
                     </pic:cNvPicPr>
                   </pic:nvPicPr>
                   <pic:blipFill>
-                    <a:blip r:embed="rId44"/>
+                    <a:blip r:embed="rId45"/>
+                    <a:stretch>
+                      <a:fillRect/>
+                    </a:stretch>
+                  </pic:blipFill>
+                  <pic:spPr bwMode="auto">
+                    <a:xfrm>
+                      <a:off x="0" y="0"/>
+                      <a:ext cx="5753100" cy="3355975"/>
+                    </a:xfrm>
+                    <a:prstGeom prst="rect">
+                      <a:avLst/>
+                    </a:prstGeom>
+                    <a:noFill/>
+                    <a:ln w="9525">
+                      <a:noFill/>
+                      <a:headEnd/>
+                      <a:tailEnd/>
+                    </a:ln>
+                  </pic:spPr>
+                </pic:pic>
+              </a:graphicData>
+            </a:graphic>
+          </wp:inline>
+        </w:drawing>
+      </w:r>
+    </w:p>
+    <w:p>
+      <w:pPr>
+        <w:pStyle w:val="SourceCode"/>
+      </w:pPr>
+      <w:r>
+        <w:br/>
+      </w:r>
+      <w:r>
+        <w:rPr>
+          <w:rStyle w:val="VerbatimChar"/>
+        </w:rPr>
+        <w:t xml:space="preserve">### Interpretation</w:t>
+      </w:r>
+    </w:p>
+    <w:p>
+      <w:pPr>
+        <w:pStyle w:val="SourceCode"/>
+      </w:pPr>
+      <w:r>
+        <w:rPr>
+          <w:rStyle w:val="VerbatimChar"/>
+        </w:rPr>
+        <w:t xml:space="preserve">- **Whole-mile occupancy** is already high (~72.1% known), consistent with pepperweed being fairly ubiquitous along the corridor at coarse scale.</w:t>
+      </w:r>
+    </w:p>
+    <w:p>
+      <w:pPr>
+        <w:pStyle w:val="SourceCode"/>
+      </w:pPr>
+      <w:r>
+        <w:rPr>
+          <w:rStyle w:val="VerbatimChar"/>
+        </w:rPr>
+        <w:t xml:space="preserve">- **0.1-mile occupancy** remains lower (~34%). The annotated horizontal gaps are the expected years of additional surveying/spread before every subsegment is known occupied at that same occupancy level.</w:t>
+      </w:r>
+    </w:p>
+    <w:p>
+      <w:pPr>
+        <w:pStyle w:val="SourceCode"/>
+      </w:pPr>
+      <w:r>
+        <w:rPr>
+          <w:rStyle w:val="VerbatimChar"/>
+        </w:rPr>
+        <w:t xml:space="preserve">- **Recent-trajectory scenario**: using only 2023–2025 whole-mile discovery (+11.5 pp/yr), cumulative mile occupancy reaches 100% around **2028**. This is the “already ubiquitous / under-surveyed” case — if the last two years’ pace continues, known whole-mile occupancy saturates almost immediately relative to the full-series logistic.</w:t>
+      </w:r>
+    </w:p>
+    <w:p>
+      <w:pPr>
+        <w:pStyle w:val="SourceCode"/>
+      </w:pPr>
+      <w:r>
+        <w:rPr>
+          <w:rStyle w:val="VerbatimChar"/>
+        </w:rPr>
+        <w:t xml:space="preserve">- Full-series linear/logistic forecasts are slower and more consistent with a sampling plateau; the recent trajectory is an upper-bound discovery scenario, not a separate biological invasion model.</w:t>
+      </w:r>
+    </w:p>
+    <w:p>
+      <w:pPr>
+        <w:pStyle w:val="SourceCode"/>
+      </w:pPr>
+      <w:r>
+        <w:rPr>
+          <w:rStyle w:val="VerbatimChar"/>
+        </w:rPr>
+        <w:t xml:space="preserve">- Increased RAS effort in currently empty miles (see Monitoring Recommendations) will accelerate cumulative discovery even without new colonization.</w:t>
+      </w:r>
+    </w:p>
+    <w:bookmarkEnd w:id="48"/>
+    <w:bookmarkEnd w:id="49"/>
+    <w:bookmarkStart w:id="53" w:name="river-mile-analysis"/>
+    <w:p>
+      <w:pPr>
+        <w:pStyle w:val="Titre1"/>
+      </w:pPr>
+      <w:r>
+        <w:t xml:space="preserve">6. River Mile Analysis</w:t>
+      </w:r>
+    </w:p>
+    <w:p>
+      <w:pPr>
+        <w:pStyle w:val="SourceCode"/>
+      </w:pPr>
+      <w:r>
+        <w:rPr>
+          <w:rStyle w:val="VerbatimChar"/>
+        </w:rPr>
+        <w:t xml:space="preserve">### Reach Boundaries (Northern Boundaries)</w:t>
+      </w:r>
+    </w:p>
+    <w:p>
+      <w:pPr>
+        <w:pStyle w:val="SourceCode"/>
+      </w:pPr>
+      <w:r>
+        <w:rPr>
+          <w:rStyle w:val="VerbatimChar"/>
+        </w:rPr>
+        <w:t xml:space="preserve">**Table showing minimum river mile for each reach (northern boundary):**</w:t>
+      </w:r>
+    </w:p>
+    <w:p>
+      <w:pPr>
+        <w:pStyle w:val="SourceCode"/>
+      </w:pPr>
+      <w:r>
+        <w:br/>
+      </w:r>
+      <w:r>
+        <w:br/>
+      </w:r>
+      <w:r>
+        <w:rPr>
+          <w:rStyle w:val="VerbatimChar"/>
+        </w:rPr>
+        <w:t xml:space="preserve">Table: Northern boundaries (minimum river miles) for each LORP reach</w:t>
+      </w:r>
+      <w:r>
+        <w:br/>
+      </w:r>
+      <w:r>
+        <w:br/>
+      </w:r>
+      <w:r>
+        <w:rPr>
+          <w:rStyle w:val="VerbatimChar"/>
+        </w:rPr>
+        <w:t xml:space="preserve">|LORP Reach   | Min River Mile | Max River Mile | Reach Number | Label Position |</w:t>
+      </w:r>
+      <w:r>
+        <w:br/>
+      </w:r>
+      <w:r>
+        <w:rPr>
+          <w:rStyle w:val="VerbatimChar"/>
+        </w:rPr>
+        <w:t xml:space="preserve">|:------------|:--------------:|:--------------:|:------------:|:--------------:|</w:t>
+      </w:r>
+      <w:r>
+        <w:br/>
+      </w:r>
+      <w:r>
+        <w:rPr>
+          <w:rStyle w:val="VerbatimChar"/>
+        </w:rPr>
+        <w:t xml:space="preserve">|LORP Reach 1 |      0.1       |      3.9       |      1       |      0.1       |</w:t>
+      </w:r>
+      <w:r>
+        <w:br/>
+      </w:r>
+      <w:r>
+        <w:rPr>
+          <w:rStyle w:val="VerbatimChar"/>
+        </w:rPr>
+        <w:t xml:space="preserve">|LORP Reach 2 |      3.7       |      19.6      |      2       |      3.7       |</w:t>
+      </w:r>
+      <w:r>
+        <w:br/>
+      </w:r>
+      <w:r>
+        <w:rPr>
+          <w:rStyle w:val="VerbatimChar"/>
+        </w:rPr>
+        <w:t xml:space="preserve">|LORP Reach 3 |      19.7      |      34.5      |      3       |      19.7      |</w:t>
+      </w:r>
+      <w:r>
+        <w:br/>
+      </w:r>
+      <w:r>
+        <w:rPr>
+          <w:rStyle w:val="VerbatimChar"/>
+        </w:rPr>
+        <w:t xml:space="preserve">|LORP Reach 4 |      34.5      |      38.1      |      4       |      34.5      |</w:t>
+      </w:r>
+      <w:r>
+        <w:br/>
+      </w:r>
+      <w:r>
+        <w:rPr>
+          <w:rStyle w:val="VerbatimChar"/>
+        </w:rPr>
+        <w:t xml:space="preserve">|LORP Reach 5 |      39.0      |      42.4      |      5       |      39.0      |</w:t>
+      </w:r>
+      <w:r>
+        <w:br/>
+      </w:r>
+      <w:r>
+        <w:rPr>
+          <w:rStyle w:val="VerbatimChar"/>
+        </w:rPr>
+        <w:t xml:space="preserve">|LORP Reach 6 |      49.7      |      53.4      |      6       |      49.7      |</w:t>
+      </w:r>
+    </w:p>
+    <w:p>
+      <w:pPr>
+        <w:pStyle w:val="SourceCode"/>
+      </w:pPr>
+      <w:r>
+        <w:br/>
+      </w:r>
+      <w:r>
+        <w:rPr>
+          <w:rStyle w:val="VerbatimChar"/>
+        </w:rPr>
+        <w:t xml:space="preserve">**Using actual reach boundaries from data:**</w:t>
+      </w:r>
+    </w:p>
+    <w:p>
+      <w:pPr>
+        <w:pStyle w:val="SourceCode"/>
+      </w:pPr>
+      <w:r>
+        <w:rPr>
+          <w:rStyle w:val="VerbatimChar"/>
+        </w:rPr>
+        <w:t xml:space="preserve"># A tibble: 6 × 5</w:t>
+      </w:r>
+      <w:r>
+        <w:br/>
+      </w:r>
+      <w:r>
+        <w:rPr>
+          <w:rStyle w:val="VerbatimChar"/>
+        </w:rPr>
+        <w:t xml:space="preserve">  Name         Min_RiverMile Max_RiverMile Reach_Num Label_Position</w:t>
+      </w:r>
+      <w:r>
+        <w:br/>
+      </w:r>
+      <w:r>
+        <w:rPr>
+          <w:rStyle w:val="VerbatimChar"/>
+        </w:rPr>
+        <w:t xml:space="preserve">  &lt;chr&gt;                &lt;dbl&gt;         &lt;dbl&gt;     &lt;int&gt;          &lt;dbl&gt;</w:t>
+      </w:r>
+      <w:r>
+        <w:br/>
+      </w:r>
+      <w:r>
+        <w:rPr>
+          <w:rStyle w:val="VerbatimChar"/>
+        </w:rPr>
+        <w:t xml:space="preserve">1 LORP Reach 1           0.1           3.9         1            0.1</w:t>
+      </w:r>
+      <w:r>
+        <w:br/>
+      </w:r>
+      <w:r>
+        <w:rPr>
+          <w:rStyle w:val="VerbatimChar"/>
+        </w:rPr>
+        <w:t xml:space="preserve">2 LORP Reach 2           3.7          19.6         2            3.7</w:t>
+      </w:r>
+      <w:r>
+        <w:br/>
+      </w:r>
+      <w:r>
+        <w:rPr>
+          <w:rStyle w:val="VerbatimChar"/>
+        </w:rPr>
+        <w:t xml:space="preserve">3 LORP Reach 3          19.7          34.5         3           19.7</w:t>
+      </w:r>
+      <w:r>
+        <w:br/>
+      </w:r>
+      <w:r>
+        <w:rPr>
+          <w:rStyle w:val="VerbatimChar"/>
+        </w:rPr>
+        <w:t xml:space="preserve">4 LORP Reach 4          34.5          38.1         4           34.5</w:t>
+      </w:r>
+      <w:r>
+        <w:br/>
+      </w:r>
+      <w:r>
+        <w:rPr>
+          <w:rStyle w:val="VerbatimChar"/>
+        </w:rPr>
+        <w:t xml:space="preserve">5 LORP Reach 5          39            42.4         5           39  </w:t>
+      </w:r>
+      <w:r>
+        <w:br/>
+      </w:r>
+      <w:r>
+        <w:rPr>
+          <w:rStyle w:val="VerbatimChar"/>
+        </w:rPr>
+        <w:t xml:space="preserve">6 LORP Reach 6          49.7          53.4         6           49.7</w:t>
+      </w:r>
+    </w:p>
+    <w:p>
+      <w:pPr>
+        <w:pStyle w:val="SourceCode"/>
+      </w:pPr>
+      <w:r>
+        <w:br/>
+      </w:r>
+      <w:r>
+        <w:rPr>
+          <w:rStyle w:val="VerbatimChar"/>
+        </w:rPr>
+        <w:t xml:space="preserve">### Reach Labels and River Miles</w:t>
+      </w:r>
+    </w:p>
+    <w:p>
+      <w:pPr>
+        <w:pStyle w:val="SourceCode"/>
+      </w:pPr>
+      <w:r>
+        <w:rPr>
+          <w:rStyle w:val="VerbatimChar"/>
+        </w:rPr>
+        <w:t xml:space="preserve">**Table showing reach labels and their river mile positions:**</w:t>
+      </w:r>
+    </w:p>
+    <w:p>
+      <w:pPr>
+        <w:pStyle w:val="SourceCode"/>
+      </w:pPr>
+      <w:r>
+        <w:br/>
+      </w:r>
+      <w:r>
+        <w:br/>
+      </w:r>
+      <w:r>
+        <w:rPr>
+          <w:rStyle w:val="VerbatimChar"/>
+        </w:rPr>
+        <w:t xml:space="preserve">Table: Reach labels and their river mile positions</w:t>
+      </w:r>
+      <w:r>
+        <w:br/>
+      </w:r>
+      <w:r>
+        <w:br/>
+      </w:r>
+      <w:r>
+        <w:rPr>
+          <w:rStyle w:val="VerbatimChar"/>
+        </w:rPr>
+        <w:t xml:space="preserve">|Reach Label  | River Mile |</w:t>
+      </w:r>
+      <w:r>
+        <w:br/>
+      </w:r>
+      <w:r>
+        <w:rPr>
+          <w:rStyle w:val="VerbatimChar"/>
+        </w:rPr>
+        <w:t xml:space="preserve">|:------------|:----------:|</w:t>
+      </w:r>
+      <w:r>
+        <w:br/>
+      </w:r>
+      <w:r>
+        <w:rPr>
+          <w:rStyle w:val="VerbatimChar"/>
+        </w:rPr>
+        <w:t xml:space="preserve">|LORP Reach 1 |    0.1     |</w:t>
+      </w:r>
+      <w:r>
+        <w:br/>
+      </w:r>
+      <w:r>
+        <w:rPr>
+          <w:rStyle w:val="VerbatimChar"/>
+        </w:rPr>
+        <w:t xml:space="preserve">|LORP Reach 2 |    3.7     |</w:t>
+      </w:r>
+      <w:r>
+        <w:br/>
+      </w:r>
+      <w:r>
+        <w:rPr>
+          <w:rStyle w:val="VerbatimChar"/>
+        </w:rPr>
+        <w:t xml:space="preserve">|LORP Reach 3 |    19.7    |</w:t>
+      </w:r>
+      <w:r>
+        <w:br/>
+      </w:r>
+      <w:r>
+        <w:rPr>
+          <w:rStyle w:val="VerbatimChar"/>
+        </w:rPr>
+        <w:t xml:space="preserve">|LORP Reach 4 |    34.5    |</w:t>
+      </w:r>
+      <w:r>
+        <w:br/>
+      </w:r>
+      <w:r>
+        <w:rPr>
+          <w:rStyle w:val="VerbatimChar"/>
+        </w:rPr>
+        <w:t xml:space="preserve">|LORP Reach 5 |    39.0    |</w:t>
+      </w:r>
+      <w:r>
+        <w:br/>
+      </w:r>
+      <w:r>
+        <w:rPr>
+          <w:rStyle w:val="VerbatimChar"/>
+        </w:rPr>
+        <w:t xml:space="preserve">|LORP Reach 6 |    49.7    |</w:t>
+      </w:r>
+    </w:p>
+    <w:p>
+      <w:pPr>
+        <w:pStyle w:val="SourceCode"/>
+      </w:pPr>
+      <w:r>
+        <w:br/>
+      </w:r>
+      <w:r>
+        <w:rPr>
+          <w:rStyle w:val="VerbatimChar"/>
+        </w:rPr>
+        <w:t xml:space="preserve">### Reach Minimum River Miles</w:t>
+      </w:r>
+    </w:p>
+    <w:p>
+      <w:pPr>
+        <w:pStyle w:val="SourceCode"/>
+      </w:pPr>
+      <w:r>
+        <w:rPr>
+          <w:rStyle w:val="VerbatimChar"/>
+        </w:rPr>
+        <w:t xml:space="preserve">**Table showing minimum river mile for each reach:**</w:t>
+      </w:r>
+    </w:p>
+    <w:p>
+      <w:pPr>
+        <w:pStyle w:val="SourceCode"/>
+      </w:pPr>
+      <w:r>
+        <w:br/>
+      </w:r>
+      <w:r>
+        <w:br/>
+      </w:r>
+      <w:r>
+        <w:rPr>
+          <w:rStyle w:val="VerbatimChar"/>
+        </w:rPr>
+        <w:t xml:space="preserve">Table: Minimum river mile for each reach</w:t>
+      </w:r>
+      <w:r>
+        <w:br/>
+      </w:r>
+      <w:r>
+        <w:br/>
+      </w:r>
+      <w:r>
+        <w:rPr>
+          <w:rStyle w:val="VerbatimChar"/>
+        </w:rPr>
+        <w:t xml:space="preserve">|Reach        | Min River Mile |</w:t>
+      </w:r>
+      <w:r>
+        <w:br/>
+      </w:r>
+      <w:r>
+        <w:rPr>
+          <w:rStyle w:val="VerbatimChar"/>
+        </w:rPr>
+        <w:t xml:space="preserve">|:------------|:--------------:|</w:t>
+      </w:r>
+      <w:r>
+        <w:br/>
+      </w:r>
+      <w:r>
+        <w:rPr>
+          <w:rStyle w:val="VerbatimChar"/>
+        </w:rPr>
+        <w:t xml:space="preserve">|LORP Reach 1 |      0.1       |</w:t>
+      </w:r>
+      <w:r>
+        <w:br/>
+      </w:r>
+      <w:r>
+        <w:rPr>
+          <w:rStyle w:val="VerbatimChar"/>
+        </w:rPr>
+        <w:t xml:space="preserve">|LORP Reach 2 |      3.7       |</w:t>
+      </w:r>
+      <w:r>
+        <w:br/>
+      </w:r>
+      <w:r>
+        <w:rPr>
+          <w:rStyle w:val="VerbatimChar"/>
+        </w:rPr>
+        <w:t xml:space="preserve">|LORP Reach 3 |      19.7      |</w:t>
+      </w:r>
+      <w:r>
+        <w:br/>
+      </w:r>
+      <w:r>
+        <w:rPr>
+          <w:rStyle w:val="VerbatimChar"/>
+        </w:rPr>
+        <w:t xml:space="preserve">|LORP Reach 4 |      34.5      |</w:t>
+      </w:r>
+      <w:r>
+        <w:br/>
+      </w:r>
+      <w:r>
+        <w:rPr>
+          <w:rStyle w:val="VerbatimChar"/>
+        </w:rPr>
+        <w:t xml:space="preserve">|LORP Reach 5 |      39.0      |</w:t>
+      </w:r>
+      <w:r>
+        <w:br/>
+      </w:r>
+      <w:r>
+        <w:rPr>
+          <w:rStyle w:val="VerbatimChar"/>
+        </w:rPr>
+        <w:t xml:space="preserve">|LORP Reach 6 |      49.7      |</w:t>
+      </w:r>
+    </w:p>
+    <w:p>
+      <w:pPr>
+        <w:pStyle w:val="SourceCode"/>
+      </w:pPr>
+      <w:r>
+        <w:br/>
+      </w:r>
+      <w:r>
+        <w:rPr>
+          <w:rStyle w:val="VerbatimChar"/>
+        </w:rPr>
+        <w:t xml:space="preserve">### Manual Reach Boundaries for Plot</w:t>
+      </w:r>
+      <w:r>
+        <w:br/>
+      </w:r>
+      <w:r>
+        <w:rPr>
+          <w:rStyle w:val="VerbatimChar"/>
+        </w:rPr>
+        <w:t xml:space="preserve">     Name Closest_Bin</w:t>
+      </w:r>
+      <w:r>
+        <w:br/>
+      </w:r>
+      <w:r>
+        <w:rPr>
+          <w:rStyle w:val="VerbatimChar"/>
+        </w:rPr>
+        <w:t xml:space="preserve">1 Reach 1           0</w:t>
+      </w:r>
+      <w:r>
+        <w:br/>
+      </w:r>
+      <w:r>
+        <w:rPr>
+          <w:rStyle w:val="VerbatimChar"/>
+        </w:rPr>
+        <w:t xml:space="preserve">2 Reach 2           4</w:t>
+      </w:r>
+      <w:r>
+        <w:br/>
+      </w:r>
+      <w:r>
+        <w:rPr>
+          <w:rStyle w:val="VerbatimChar"/>
+        </w:rPr>
+        <w:t xml:space="preserve">3 Reach 3          20</w:t>
+      </w:r>
+      <w:r>
+        <w:br/>
+      </w:r>
+      <w:r>
+        <w:rPr>
+          <w:rStyle w:val="VerbatimChar"/>
+        </w:rPr>
+        <w:t xml:space="preserve">4 Reach 4          35</w:t>
+      </w:r>
+      <w:r>
+        <w:br/>
+      </w:r>
+      <w:r>
+        <w:rPr>
+          <w:rStyle w:val="VerbatimChar"/>
+        </w:rPr>
+        <w:t xml:space="preserve">5 Reach 5          39</w:t>
+      </w:r>
+      <w:r>
+        <w:br/>
+      </w:r>
+      <w:r>
+        <w:rPr>
+          <w:rStyle w:val="VerbatimChar"/>
+        </w:rPr>
+        <w:t xml:space="preserve">6 Reach 6          50</w:t>
+      </w:r>
+    </w:p>
+    <w:p>
+      <w:pPr>
+        <w:pStyle w:val="FirstParagraph"/>
+      </w:pPr>
+      <w:r>
+        <w:drawing>
+          <wp:inline>
+            <wp:extent cx="5753100" cy="4314825"/>
+            <wp:effectExtent b="0" l="0" r="0" t="0"/>
+            <wp:docPr descr="" title="" id="51" name="Picture"/>
+            <a:graphic>
+              <a:graphicData uri="http://schemas.openxmlformats.org/drawingml/2006/picture">
+                <pic:pic>
+                  <pic:nvPicPr>
+                    <pic:cNvPr descr="index_files/figure-docx/river-mile-analysis-1.png" id="52" name="Picture"/>
+                    <pic:cNvPicPr>
+                      <a:picLocks noChangeArrowheads="1" noChangeAspect="1"/>
+                    </pic:cNvPicPr>
+                  </pic:nvPicPr>
+                  <pic:blipFill>
+                    <a:blip r:embed="rId50"/>
                     <a:stretch>
                       <a:fillRect/>
                     </a:stretch>
@@ -1141,7 +2839,7 @@
         <w:rPr>
           <w:rStyle w:val="VerbatimChar"/>
         </w:rPr>
-        <w:t xml:space="preserve">**Total River Miles Analyzed**: 54 </w:t>
+        <w:t xml:space="preserve">**Total River Miles Analyzed**: 61 </w:t>
       </w:r>
       <w:r>
         <w:br/>
@@ -1159,7 +2857,7 @@
         <w:rPr>
           <w:rStyle w:val="VerbatimChar"/>
         </w:rPr>
-        <w:t xml:space="preserve">**River Mile Range**: 0 - 53 </w:t>
+        <w:t xml:space="preserve">**River Mile Range**: 0 - 60 </w:t>
       </w:r>
       <w:r>
         <w:br/>
@@ -1264,23 +2962,585 @@
         <w:t xml:space="preserve">- **River Mile 29 **: 51 sites</w:t>
       </w:r>
     </w:p>
-    <w:bookmarkEnd w:id="47"/>
-    <w:bookmarkStart w:id="49" w:name="field-documentation"/>
+    <w:bookmarkEnd w:id="53"/>
+    <w:bookmarkStart w:id="59" w:name="monitoring-recommendations"/>
     <w:p>
       <w:pPr>
         <w:pStyle w:val="Titre1"/>
       </w:pPr>
       <w:r>
-        <w:t xml:space="preserve">6. Field Documentation</w:t>
-      </w:r>
-    </w:p>
-    <w:bookmarkStart w:id="48" w:name="field-documentation-images"/>
+        <w:t xml:space="preserve">7. 2026 Monitoring Recommendations</w:t>
+      </w:r>
+    </w:p>
+    <w:p>
+      <w:pPr>
+        <w:pStyle w:val="FirstParagraph"/>
+      </w:pPr>
+      <w:r>
+        <w:t xml:space="preserve">The</w:t>
+      </w:r>
+      <w:r>
+        <w:t xml:space="preserve"> </w:t>
+      </w:r>
+      <w:hyperlink r:id="rId20">
+        <w:r>
+          <w:rPr>
+            <w:rStyle w:val="Hyperlink"/>
+          </w:rPr>
+          <w:t xml:space="preserve">FY 2026–2027 LORP work plan</w:t>
+        </w:r>
+      </w:hyperlink>
+      <w:r>
+        <w:t xml:space="preserve"> </w:t>
+      </w:r>
+      <w:r>
+        <w:t xml:space="preserve">directs summer RAS (rapid assessment survey) monitoring to focus on areas</w:t>
+      </w:r>
+      <w:r>
+        <w:t xml:space="preserve"> </w:t>
+      </w:r>
+      <w:r>
+        <w:rPr>
+          <w:b/>
+          <w:bCs/>
+        </w:rPr>
+        <w:t xml:space="preserve">without known pepperweed populations</w:t>
+      </w:r>
+      <w:r>
+        <w:t xml:space="preserve">. Study-design crosswalk:</w:t>
+      </w:r>
+      <w:r>
+        <w:t xml:space="preserve"> </w:t>
+      </w:r>
+      <w:hyperlink r:id="rId54">
+        <w:r>
+          <w:rPr>
+            <w:rStyle w:val="VerbatimChar"/>
+          </w:rPr>
+          <w:t xml:space="preserve">lorp-pia-completion</w:t>
+        </w:r>
+        <w:r>
+          <w:rPr>
+            <w:rStyle w:val="Hyperlink"/>
+          </w:rPr>
+          <w:t xml:space="preserve"> </w:t>
+        </w:r>
+        <w:r>
+          <w:rPr>
+            <w:rStyle w:val="Hyperlink"/>
+          </w:rPr>
+          <w:t xml:space="preserve">Doc 11</w:t>
+        </w:r>
+      </w:hyperlink>
+      <w:r>
+        <w:t xml:space="preserve">. The tables below are derived from 2018–2025 occurrence data binned to whole river miles (see</w:t>
+      </w:r>
+      <w:r>
+        <w:t xml:space="preserve"> </w:t>
+      </w:r>
+      <w:hyperlink w:anchor="river-mile-analysis">
+        <w:r>
+          <w:rPr>
+            <w:rStyle w:val="Hyperlink"/>
+          </w:rPr>
+          <w:t xml:space="preserve">River Mile Analysis</w:t>
+        </w:r>
+      </w:hyperlink>
+      <w:r>
+        <w:t xml:space="preserve">).</w:t>
+      </w:r>
+    </w:p>
+    <w:p>
+      <w:pPr>
+        <w:pStyle w:val="SourceCode"/>
+      </w:pPr>
+      <w:r>
+        <w:rPr>
+          <w:rStyle w:val="VerbatimChar"/>
+        </w:rPr>
+        <w:t xml:space="preserve">## Priority Survey Areas</w:t>
+      </w:r>
+      <w:r>
+        <w:br/>
+      </w:r>
+      <w:r>
+        <w:rPr>
+          <w:rStyle w:val="VerbatimChar"/>
+        </w:rPr>
+        <w:t xml:space="preserve">River-mile segments with **no pepperweed detections on the river corridor** in any survey year (`r params$start_year`–`r params$current_year`). Only sites within 250 m of a river-mile marker count toward occupancy (off-channel ditch/field points are excluded so they do not falsely mark a mile as occupied). These align with the workplan objective to survey unoccupied corridor.</w:t>
+      </w:r>
+      <w:r>
+        <w:br/>
+      </w:r>
+      <w:r>
+        <w:br/>
+      </w:r>
+      <w:r>
+        <w:br/>
+      </w:r>
+      <w:r>
+        <w:br/>
+      </w:r>
+      <w:r>
+        <w:rPr>
+          <w:rStyle w:val="VerbatimChar"/>
+        </w:rPr>
+        <w:t xml:space="preserve">Table: Recommended 2026 RAS survey segments without known pepperweed (n = 20 river miles, 32.8% of 0–60 RM corridor)</w:t>
+      </w:r>
+      <w:r>
+        <w:br/>
+      </w:r>
+      <w:r>
+        <w:br/>
+      </w:r>
+      <w:r>
+        <w:rPr>
+          <w:rStyle w:val="VerbatimChar"/>
+        </w:rPr>
+        <w:t xml:space="preserve">|Priority |River Mile Range | Length (mi) | Reach |Population Status                |Bank Guidance     |</w:t>
+      </w:r>
+      <w:r>
+        <w:br/>
+      </w:r>
+      <w:r>
+        <w:rPr>
+          <w:rStyle w:val="VerbatimChar"/>
+        </w:rPr>
+        <w:t xml:space="preserve">|:--------|:----------------|:-----------:|:-----:|:--------------------------------|:-----------------|</w:t>
+      </w:r>
+      <w:r>
+        <w:br/>
+      </w:r>
+      <w:r>
+        <w:rPr>
+          <w:rStyle w:val="VerbatimChar"/>
+        </w:rPr>
+        <w:t xml:space="preserve">|High     |RM 54–60         |      7      |  R6   |No known populations (all years) |Survey both banks |</w:t>
+      </w:r>
+      <w:r>
+        <w:br/>
+      </w:r>
+      <w:r>
+        <w:rPr>
+          <w:rStyle w:val="VerbatimChar"/>
+        </w:rPr>
+        <w:t xml:space="preserve">|High     |RM 43–48         |      6      |  R6   |No known populations (all years) |Survey both banks |</w:t>
+      </w:r>
+      <w:r>
+        <w:br/>
+      </w:r>
+      <w:r>
+        <w:rPr>
+          <w:rStyle w:val="VerbatimChar"/>
+        </w:rPr>
+        <w:t xml:space="preserve">|Medium   |RM 21–22         |      2      |  R3   |No known populations (all years) |Survey both banks |</w:t>
+      </w:r>
+      <w:r>
+        <w:br/>
+      </w:r>
+      <w:r>
+        <w:rPr>
+          <w:rStyle w:val="VerbatimChar"/>
+        </w:rPr>
+        <w:t xml:space="preserve">|Medium   |RM 35–36         |      2      |  R4   |No known populations (all years) |Survey both banks |</w:t>
+      </w:r>
+      <w:r>
+        <w:br/>
+      </w:r>
+      <w:r>
+        <w:rPr>
+          <w:rStyle w:val="VerbatimChar"/>
+        </w:rPr>
+        <w:t xml:space="preserve">|Medium   |RM 51–52         |      2      |  R6   |No known populations (all years) |Survey both banks |</w:t>
+      </w:r>
+      <w:r>
+        <w:br/>
+      </w:r>
+      <w:r>
+        <w:rPr>
+          <w:rStyle w:val="VerbatimChar"/>
+        </w:rPr>
+        <w:t xml:space="preserve">|Low      |RM 24            |      1      |  R3   |No known populations (all years) |Survey both banks |</w:t>
+      </w:r>
+      <w:r>
+        <w:br/>
+      </w:r>
+      <w:r>
+        <w:br/>
+      </w:r>
+      <w:r>
+        <w:rPr>
+          <w:rStyle w:val="VerbatimChar"/>
+        </w:rPr>
+        <w:t xml:space="preserve">**Summary:**  20  of  61  river miles ( 32.8 %) have no recorded pepperweed. The largest gaps are **RM 43–48** and **RM 54–60** in Reach 6; smaller gaps occur at **RM 22** and **RM 24** within Reach 3.</w:t>
+      </w:r>
+    </w:p>
+    <w:p>
+      <w:pPr>
+        <w:pStyle w:val="SourceCode"/>
+      </w:pPr>
+      <w:r>
+        <w:rPr>
+          <w:rStyle w:val="VerbatimChar"/>
+        </w:rPr>
+        <w:t xml:space="preserve">## East / West Bank Planning Notes</w:t>
+      </w:r>
+    </w:p>
+    <w:p>
+      <w:pPr>
+        <w:pStyle w:val="SourceCode"/>
+      </w:pPr>
+      <w:r>
+        <w:rPr>
+          <w:rStyle w:val="VerbatimChar"/>
+        </w:rPr>
+        <w:t xml:space="preserve">Historical surveys do not record bank side in the feature service. For planning purposes, site coordinates were classified as **east** or **west** of the river centerline using the local channel direction at each river mile.</w:t>
+      </w:r>
+    </w:p>
+    <w:p>
+      <w:pPr>
+        <w:pStyle w:val="SourceCode"/>
+      </w:pPr>
+      <w:r>
+        <w:rPr>
+          <w:rStyle w:val="VerbatimChar"/>
+        </w:rPr>
+        <w:t xml:space="preserve">- **Unoccupied miles** (table above): survey **both banks** — absence of detections does not indicate which bank was visited.</w:t>
+      </w:r>
+    </w:p>
+    <w:p>
+      <w:pPr>
+        <w:pStyle w:val="SourceCode"/>
+      </w:pPr>
+      <w:r>
+        <w:rPr>
+          <w:rStyle w:val="VerbatimChar"/>
+        </w:rPr>
+        <w:t xml:space="preserve">- **Partially occupied miles** (table below): where all detections fall on one bank, the opposite bank may warrant targeted survey even though populations are known nearby.</w:t>
+      </w:r>
+    </w:p>
+    <w:p>
+      <w:pPr>
+        <w:pStyle w:val="SourceCode"/>
+      </w:pPr>
+      <w:r>
+        <w:br/>
+      </w:r>
+      <w:r>
+        <w:br/>
+      </w:r>
+      <w:r>
+        <w:rPr>
+          <w:rStyle w:val="VerbatimChar"/>
+        </w:rPr>
+        <w:t xml:space="preserve">Table: River miles with detections on a single bank only (2018–2025)</w:t>
+      </w:r>
+      <w:r>
+        <w:br/>
+      </w:r>
+      <w:r>
+        <w:br/>
+      </w:r>
+      <w:r>
+        <w:rPr>
+          <w:rStyle w:val="VerbatimChar"/>
+        </w:rPr>
+        <w:t xml:space="preserve">|River Mile | Reach | Sites |Banks w/ Detections |Bank to Survey |Planning Note                               |</w:t>
+      </w:r>
+      <w:r>
+        <w:br/>
+      </w:r>
+      <w:r>
+        <w:rPr>
+          <w:rStyle w:val="VerbatimChar"/>
+        </w:rPr>
+        <w:t xml:space="preserve">|:----------|:-----:|:-----:|:-------------------|:--------------|:-------------------------------------------|</w:t>
+      </w:r>
+      <w:r>
+        <w:br/>
+      </w:r>
+      <w:r>
+        <w:rPr>
+          <w:rStyle w:val="VerbatimChar"/>
+        </w:rPr>
+        <w:t xml:space="preserve">|RM 15      |  R2   |   3   |East only           |West           |Detections on east only; consider West bank |</w:t>
+      </w:r>
+      <w:r>
+        <w:br/>
+      </w:r>
+      <w:r>
+        <w:rPr>
+          <w:rStyle w:val="VerbatimChar"/>
+        </w:rPr>
+        <w:t xml:space="preserve">|RM 16      |  R2   |  14   |East only           |West           |Detections on east only; consider West bank |</w:t>
+      </w:r>
+      <w:r>
+        <w:br/>
+      </w:r>
+      <w:r>
+        <w:rPr>
+          <w:rStyle w:val="VerbatimChar"/>
+        </w:rPr>
+        <w:t xml:space="preserve">|RM 18      |  R2   |   3   |West only           |East           |Detections on west only; consider East bank |</w:t>
+      </w:r>
+      <w:r>
+        <w:br/>
+      </w:r>
+      <w:r>
+        <w:rPr>
+          <w:rStyle w:val="VerbatimChar"/>
+        </w:rPr>
+        <w:t xml:space="preserve">|RM 19      |  R2   |  13   |East only           |West           |Detections on east only; consider West bank |</w:t>
+      </w:r>
+      <w:r>
+        <w:br/>
+      </w:r>
+      <w:r>
+        <w:rPr>
+          <w:rStyle w:val="VerbatimChar"/>
+        </w:rPr>
+        <w:t xml:space="preserve">|RM 23      |  R3   |   1   |East only           |West           |Detections on east only; consider West bank |</w:t>
+      </w:r>
+      <w:r>
+        <w:br/>
+      </w:r>
+      <w:r>
+        <w:rPr>
+          <w:rStyle w:val="VerbatimChar"/>
+        </w:rPr>
+        <w:t xml:space="preserve">|RM 25      |  R3   |   7   |East only           |West           |Detections on east only; consider West bank |</w:t>
+      </w:r>
+      <w:r>
+        <w:br/>
+      </w:r>
+      <w:r>
+        <w:rPr>
+          <w:rStyle w:val="VerbatimChar"/>
+        </w:rPr>
+        <w:t xml:space="preserve">|RM 39      |  R5   |   1   |East only           |West           |Detections on east only; consider West bank |</w:t>
+      </w:r>
+      <w:r>
+        <w:br/>
+      </w:r>
+      <w:r>
+        <w:rPr>
+          <w:rStyle w:val="VerbatimChar"/>
+        </w:rPr>
+        <w:t xml:space="preserve">|RM 40      |  R5   |   3   |East only           |West           |Detections on east only; consider West bank |</w:t>
+      </w:r>
+      <w:r>
+        <w:br/>
+      </w:r>
+      <w:r>
+        <w:rPr>
+          <w:rStyle w:val="VerbatimChar"/>
+        </w:rPr>
+        <w:t xml:space="preserve">|RM 41      |  R5   |   5   |East only           |West           |Detections on east only; consider West bank |</w:t>
+      </w:r>
+      <w:r>
+        <w:br/>
+      </w:r>
+      <w:r>
+        <w:rPr>
+          <w:rStyle w:val="VerbatimChar"/>
+        </w:rPr>
+        <w:t xml:space="preserve">|RM 42      |  R5   |   3   |East only           |West           |Detections on east only; consider West bank |</w:t>
+      </w:r>
+      <w:r>
+        <w:br/>
+      </w:r>
+      <w:r>
+        <w:rPr>
+          <w:rStyle w:val="VerbatimChar"/>
+        </w:rPr>
+        <w:t xml:space="preserve">|RM 49      |  R6   |   1   |West only           |East           |Detections on west only; consider East bank |</w:t>
+      </w:r>
+      <w:r>
+        <w:br/>
+      </w:r>
+      <w:r>
+        <w:rPr>
+          <w:rStyle w:val="VerbatimChar"/>
+        </w:rPr>
+        <w:t xml:space="preserve">|RM 50      |  R6   |   1   |West only           |East           |Detections on west only; consider East bank |</w:t>
+      </w:r>
+      <w:r>
+        <w:br/>
+      </w:r>
+      <w:r>
+        <w:rPr>
+          <w:rStyle w:val="VerbatimChar"/>
+        </w:rPr>
+        <w:t xml:space="preserve">|RM 53      |  R6   |   1   |East only           |West           |Detections on east only; consider West bank |</w:t>
+      </w:r>
+    </w:p>
+    <w:p>
+      <w:pPr>
+        <w:pStyle w:val="SourceCode"/>
+      </w:pPr>
+      <w:r>
+        <w:br/>
+      </w:r>
+      <w:r>
+        <w:rPr>
+          <w:rStyle w:val="VerbatimChar"/>
+        </w:rPr>
+        <w:t xml:space="preserve">### Suggested 2026 Survey Sequence</w:t>
+      </w:r>
+    </w:p>
+    <w:p>
+      <w:pPr>
+        <w:pStyle w:val="SourceCode"/>
+      </w:pPr>
+      <w:r>
+        <w:rPr>
+          <w:rStyle w:val="VerbatimChar"/>
+        </w:rPr>
+        <w:t xml:space="preserve">1. **Reach 6 lower corridor (RM 43–48, 51–52, 54–60)** — largest unoccupied segments; highest workplan priority.</w:t>
+      </w:r>
+    </w:p>
+    <w:p>
+      <w:pPr>
+        <w:pStyle w:val="SourceCode"/>
+      </w:pPr>
+      <w:r>
+        <w:rPr>
+          <w:rStyle w:val="VerbatimChar"/>
+        </w:rPr>
+        <w:t xml:space="preserve">2. **Reach 3 gap miles (RM 21–22, 24)** — short unoccupied segments within otherwise occupied reach; efficient to cover during Reach 3 transit.</w:t>
+      </w:r>
+    </w:p>
+    <w:p>
+      <w:pPr>
+        <w:pStyle w:val="SourceCode"/>
+      </w:pPr>
+      <w:r>
+        <w:rPr>
+          <w:rStyle w:val="VerbatimChar"/>
+        </w:rPr>
+        <w:t xml:space="preserve">3. **Single-bank follow-up** — optional targeted passes on the undetected bank at miles listed above, if crew capacity allows.</w:t>
+      </w:r>
+    </w:p>
+    <w:p>
+      <w:pPr>
+        <w:pStyle w:val="SourceCode"/>
+      </w:pPr>
+      <w:r>
+        <w:br/>
+      </w:r>
+      <w:r>
+        <w:rPr>
+          <w:rStyle w:val="VerbatimChar"/>
+        </w:rPr>
+        <w:t xml:space="preserve">### Access and Route Planning (next step)</w:t>
+      </w:r>
+    </w:p>
+    <w:p>
+      <w:pPr>
+        <w:pStyle w:val="SourceCode"/>
+      </w:pPr>
+      <w:r>
+        <w:rPr>
+          <w:rStyle w:val="VerbatimChar"/>
+        </w:rPr>
+        <w:t xml:space="preserve">The current navigation polygons follow the **mainstem river-mile centerline** (±100 m). That is enough to flag *where* to look, but not *how* crews actually move:</w:t>
+      </w:r>
+    </w:p>
+    <w:p>
+      <w:pPr>
+        <w:pStyle w:val="SourceCode"/>
+      </w:pPr>
+      <w:r>
+        <w:rPr>
+          <w:rStyle w:val="VerbatimChar"/>
+        </w:rPr>
+        <w:t xml:space="preserve">- **Secondary channels / side channels** often carry the walkable or boat-accessible path and may hold pepperweed even when the mapped mainstem mile looks empty.</w:t>
+      </w:r>
+    </w:p>
+    <w:p>
+      <w:pPr>
+        <w:pStyle w:val="SourceCode"/>
+      </w:pPr>
+      <w:r>
+        <w:rPr>
+          <w:rStyle w:val="VerbatimChar"/>
+        </w:rPr>
+        <w:t xml:space="preserve">- **Prior RAS tracklogs** (Field Maps / Collector GPS tracks) show which banks and braids were reachable in past years — the practical route network for planning day sheets.</w:t>
+      </w:r>
+    </w:p>
+    <w:p>
+      <w:pPr>
+        <w:pStyle w:val="SourceCode"/>
+      </w:pPr>
+      <w:r>
+        <w:rPr>
+          <w:rStyle w:val="VerbatimChar"/>
+        </w:rPr>
+        <w:t xml:space="preserve">**Recommended workflow once those layers are available:**</w:t>
+      </w:r>
+    </w:p>
+    <w:p>
+      <w:pPr>
+        <w:pStyle w:val="SourceCode"/>
+      </w:pPr>
+      <w:r>
+        <w:rPr>
+          <w:rStyle w:val="VerbatimChar"/>
+        </w:rPr>
+        <w:t xml:space="preserve">1. Overlay secondary-channel lines + historical tracklogs on the 2026 gap polygons.</w:t>
+      </w:r>
+    </w:p>
+    <w:p>
+      <w:pPr>
+        <w:pStyle w:val="SourceCode"/>
+      </w:pPr>
+      <w:r>
+        <w:rPr>
+          <w:rStyle w:val="VerbatimChar"/>
+        </w:rPr>
+        <w:t xml:space="preserve">2. Clip or redraw survey units to follow accessible routes (not axis-aligned mainstem boxes).</w:t>
+      </w:r>
+    </w:p>
+    <w:p>
+      <w:pPr>
+        <w:pStyle w:val="SourceCode"/>
+      </w:pPr>
+      <w:r>
+        <w:rPr>
+          <w:rStyle w:val="VerbatimChar"/>
+        </w:rPr>
+        <w:t xml:space="preserve">3. Tag each unit with `Access` (mainstem / secondary / tracklog-only) and preferred entry points.</w:t>
+      </w:r>
+    </w:p>
+    <w:p>
+      <w:pPr>
+        <w:pStyle w:val="SourceCode"/>
+      </w:pPr>
+      <w:r>
+        <w:rPr>
+          <w:rStyle w:val="VerbatimChar"/>
+        </w:rPr>
+        <w:t xml:space="preserve">4. Re-export the Field Maps layer so staff navigate along known paths through negative space.</w:t>
+      </w:r>
+    </w:p>
+    <w:p>
+      <w:pPr>
+        <w:pStyle w:val="SourceCode"/>
+      </w:pPr>
+      <w:r>
+        <w:rPr>
+          <w:rStyle w:val="VerbatimChar"/>
+        </w:rPr>
+        <w:t xml:space="preserve">*Drop GPX/GeoJSON tracklogs or an AGOL item URL into `data/` (or share the service link) and this export can be rebuilt on those routes.*</w:t>
+      </w:r>
+    </w:p>
+    <w:bookmarkStart w:id="58" w:name="field-maps-navigation-layer"/>
     <w:p>
       <w:pPr>
         <w:pStyle w:val="Titre2"/>
       </w:pPr>
       <w:r>
-        <w:t xml:space="preserve">6.1 Field Documentation Images</w:t>
+        <w:t xml:space="preserve">7.1 Field Maps Navigation Layer</w:t>
       </w:r>
     </w:p>
     <w:p>
@@ -1288,6 +3548,458 @@
         <w:pStyle w:val="FirstParagraph"/>
       </w:pPr>
       <w:r>
+        <w:rPr>
+          <w:b/>
+          <w:bCs/>
+        </w:rPr>
+        <w:t xml:space="preserve">Area without RAS detections</w:t>
+      </w:r>
+      <w:r>
+        <w:t xml:space="preserve"> </w:t>
+      </w:r>
+      <w:r>
+        <w:t xml:space="preserve">= June 2023</w:t>
+      </w:r>
+      <w:r>
+        <w:t xml:space="preserve"> </w:t>
+      </w:r>
+      <w:hyperlink r:id="rId55">
+        <w:r>
+          <w:rPr>
+            <w:rStyle w:val="Hyperlink"/>
+          </w:rPr>
+          <w:t xml:space="preserve">high-water</w:t>
+        </w:r>
+      </w:hyperlink>
+      <w:r>
+        <w:t xml:space="preserve"> </w:t>
+      </w:r>
+      <w:r>
+        <w:t xml:space="preserve">floodplain (</w:t>
+      </w:r>
+      <w:hyperlink r:id="rId56">
+        <w:r>
+          <w:rPr>
+            <w:rStyle w:val="Hyperlink"/>
+          </w:rPr>
+          <w:t xml:space="preserve">south</w:t>
+        </w:r>
+      </w:hyperlink>
+      <w:r>
+        <w:t xml:space="preserve"> </w:t>
+      </w:r>
+      <w:r>
+        <w:t xml:space="preserve">+ north), split by river mile and bank,</w:t>
+      </w:r>
+      <w:r>
+        <w:t xml:space="preserve"> </w:t>
+      </w:r>
+      <w:r>
+        <w:rPr>
+          <w:b/>
+          <w:bCs/>
+        </w:rPr>
+        <w:t xml:space="preserve">minus</w:t>
+      </w:r>
+      <w:r>
+        <w:t xml:space="preserve"> </w:t>
+      </w:r>
+      <w:r>
+        <w:t xml:space="preserve">bank sides that already have pepperweed detections. The</w:t>
+      </w:r>
+      <w:r>
+        <w:t xml:space="preserve"> </w:t>
+      </w:r>
+      <w:hyperlink r:id="rId57">
+        <w:r>
+          <w:rPr>
+            <w:rStyle w:val="Hyperlink"/>
+          </w:rPr>
+          <w:t xml:space="preserve">multithreaded river</w:t>
+        </w:r>
+      </w:hyperlink>
+      <w:r>
+        <w:t xml:space="preserve"> </w:t>
+      </w:r>
+      <w:r>
+        <w:t xml:space="preserve">is included as a reference layer.</w:t>
+      </w:r>
+    </w:p>
+    <w:p>
+      <w:pPr>
+        <w:pStyle w:val="BodyText"/>
+      </w:pPr>
+      <w:r>
+        <w:t xml:space="preserve">Download — area without RAS detections</w:t>
+      </w:r>
+    </w:p>
+    <w:p>
+      <w:pPr>
+        <w:pStyle w:val="BodyText"/>
+      </w:pPr>
+      <w:r>
+        <w:t xml:space="preserve">52 units (~2376.6 acres): high-water floodplain on bank sides with</w:t>
+      </w:r>
+      <w:r>
+        <w:t xml:space="preserve"> </w:t>
+      </w:r>
+      <w:r>
+        <w:t xml:space="preserve">zero</w:t>
+      </w:r>
+      <w:r>
+        <w:t xml:space="preserve"> </w:t>
+      </w:r>
+      <w:r>
+        <w:t xml:space="preserve">pepperweed detections for that river mile.</w:t>
+      </w:r>
+    </w:p>
+    <w:p>
+      <w:pPr>
+        <w:pStyle w:val="BodyText"/>
+      </w:pPr>
+      <w:r>
+        <w:t xml:space="preserve">Shapefile (zip) — Field Maps</w:t>
+      </w:r>
+      <w:r>
+        <w:t xml:space="preserve"> </w:t>
+      </w:r>
+      <w:r>
+        <w:t xml:space="preserve">No-detection units GeoJSON</w:t>
+      </w:r>
+      <w:r>
+        <w:t xml:space="preserve"> </w:t>
+      </w:r>
+      <w:r>
+        <w:t xml:space="preserve">High-water floodplain</w:t>
+      </w:r>
+      <w:r>
+        <w:t xml:space="preserve"> </w:t>
+      </w:r>
+      <w:r>
+        <w:t xml:space="preserve">River channels</w:t>
+      </w:r>
+      <w:r>
+        <w:t xml:space="preserve"> </w:t>
+      </w:r>
+      <w:r>
+        <w:t xml:space="preserve">Banks with detections</w:t>
+      </w:r>
+    </w:p>
+    <w:p>
+      <w:pPr>
+        <w:pStyle w:val="TableCaption"/>
+      </w:pPr>
+      <w:r>
+        <w:t xml:space="preserve">Area without RAS detections (high water − detected bank side)</w:t>
+      </w:r>
+    </w:p>
+    <w:tbl>
+      <w:tblPr>
+        <w:tblStyle w:val="Table"/>
+        <w:tblW w:type="auto" w:w="0"/>
+        <w:tblLook w:firstRow="1" w:lastRow="0" w:firstColumn="0" w:lastColumn="0" w:noHBand="0" w:noVBand="0" w:val="0020"/>
+        <w:tblCaption w:val="Area without RAS detections (high water − detected bank side)"/>
+      </w:tblPr>
+      <w:tblGrid>
+        <w:gridCol w:w="2640"/>
+        <w:gridCol w:w="2640"/>
+        <w:gridCol w:w="2640"/>
+      </w:tblGrid>
+      <w:tr>
+        <w:trPr>
+          <w:tblHeader w:val="on"/>
+        </w:trPr>
+        <w:tc>
+          <w:tcPr/>
+          <w:p>
+            <w:pPr>
+              <w:pStyle w:val="Compact"/>
+              <w:jc w:val="left"/>
+            </w:pPr>
+            <w:r>
+              <w:t xml:space="preserve">Priority</w:t>
+            </w:r>
+          </w:p>
+        </w:tc>
+        <w:tc>
+          <w:tcPr/>
+          <w:p>
+            <w:pPr>
+              <w:pStyle w:val="Compact"/>
+              <w:jc w:val="left"/>
+            </w:pPr>
+            <w:r>
+              <w:t xml:space="preserve">Bank</w:t>
+            </w:r>
+          </w:p>
+        </w:tc>
+        <w:tc>
+          <w:tcPr/>
+          <w:p>
+            <w:pPr>
+              <w:pStyle w:val="Compact"/>
+              <w:jc w:val="center"/>
+            </w:pPr>
+            <w:r>
+              <w:t xml:space="preserve">Units</w:t>
+            </w:r>
+          </w:p>
+        </w:tc>
+      </w:tr>
+      <w:tr>
+        <w:tc>
+          <w:tcPr/>
+          <w:p>
+            <w:pPr>
+              <w:pStyle w:val="Compact"/>
+              <w:jc w:val="left"/>
+            </w:pPr>
+            <w:r>
+              <w:t xml:space="preserve">High</w:t>
+            </w:r>
+          </w:p>
+        </w:tc>
+        <w:tc>
+          <w:tcPr/>
+          <w:p>
+            <w:pPr>
+              <w:pStyle w:val="Compact"/>
+              <w:jc w:val="left"/>
+            </w:pPr>
+            <w:r>
+              <w:t xml:space="preserve">East</w:t>
+            </w:r>
+          </w:p>
+        </w:tc>
+        <w:tc>
+          <w:tcPr/>
+          <w:p>
+            <w:pPr>
+              <w:pStyle w:val="Compact"/>
+              <w:jc w:val="center"/>
+            </w:pPr>
+            <w:r>
+              <w:t xml:space="preserve">14</w:t>
+            </w:r>
+          </w:p>
+        </w:tc>
+      </w:tr>
+      <w:tr>
+        <w:tc>
+          <w:tcPr/>
+          <w:p>
+            <w:pPr>
+              <w:pStyle w:val="Compact"/>
+              <w:jc w:val="left"/>
+            </w:pPr>
+            <w:r>
+              <w:t xml:space="preserve">High</w:t>
+            </w:r>
+          </w:p>
+        </w:tc>
+        <w:tc>
+          <w:tcPr/>
+          <w:p>
+            <w:pPr>
+              <w:pStyle w:val="Compact"/>
+              <w:jc w:val="left"/>
+            </w:pPr>
+            <w:r>
+              <w:t xml:space="preserve">West</w:t>
+            </w:r>
+          </w:p>
+        </w:tc>
+        <w:tc>
+          <w:tcPr/>
+          <w:p>
+            <w:pPr>
+              <w:pStyle w:val="Compact"/>
+              <w:jc w:val="center"/>
+            </w:pPr>
+            <w:r>
+              <w:t xml:space="preserve">14</w:t>
+            </w:r>
+          </w:p>
+        </w:tc>
+      </w:tr>
+      <w:tr>
+        <w:tc>
+          <w:tcPr/>
+          <w:p>
+            <w:pPr>
+              <w:pStyle w:val="Compact"/>
+              <w:jc w:val="left"/>
+            </w:pPr>
+            <w:r>
+              <w:t xml:space="preserve">Medium</w:t>
+            </w:r>
+          </w:p>
+        </w:tc>
+        <w:tc>
+          <w:tcPr/>
+          <w:p>
+            <w:pPr>
+              <w:pStyle w:val="Compact"/>
+              <w:jc w:val="left"/>
+            </w:pPr>
+            <w:r>
+              <w:t xml:space="preserve">East</w:t>
+            </w:r>
+          </w:p>
+        </w:tc>
+        <w:tc>
+          <w:tcPr/>
+          <w:p>
+            <w:pPr>
+              <w:pStyle w:val="Compact"/>
+              <w:jc w:val="center"/>
+            </w:pPr>
+            <w:r>
+              <w:t xml:space="preserve">5</w:t>
+            </w:r>
+          </w:p>
+        </w:tc>
+      </w:tr>
+      <w:tr>
+        <w:tc>
+          <w:tcPr/>
+          <w:p>
+            <w:pPr>
+              <w:pStyle w:val="Compact"/>
+              <w:jc w:val="left"/>
+            </w:pPr>
+            <w:r>
+              <w:t xml:space="preserve">Medium</w:t>
+            </w:r>
+          </w:p>
+        </w:tc>
+        <w:tc>
+          <w:tcPr/>
+          <w:p>
+            <w:pPr>
+              <w:pStyle w:val="Compact"/>
+              <w:jc w:val="left"/>
+            </w:pPr>
+            <w:r>
+              <w:t xml:space="preserve">West</w:t>
+            </w:r>
+          </w:p>
+        </w:tc>
+        <w:tc>
+          <w:tcPr/>
+          <w:p>
+            <w:pPr>
+              <w:pStyle w:val="Compact"/>
+              <w:jc w:val="center"/>
+            </w:pPr>
+            <w:r>
+              <w:t xml:space="preserve">7</w:t>
+            </w:r>
+          </w:p>
+        </w:tc>
+      </w:tr>
+      <w:tr>
+        <w:tc>
+          <w:tcPr/>
+          <w:p>
+            <w:pPr>
+              <w:pStyle w:val="Compact"/>
+              <w:jc w:val="left"/>
+            </w:pPr>
+            <w:r>
+              <w:t xml:space="preserve">Low</w:t>
+            </w:r>
+          </w:p>
+        </w:tc>
+        <w:tc>
+          <w:tcPr/>
+          <w:p>
+            <w:pPr>
+              <w:pStyle w:val="Compact"/>
+              <w:jc w:val="left"/>
+            </w:pPr>
+            <w:r>
+              <w:t xml:space="preserve">East</w:t>
+            </w:r>
+          </w:p>
+        </w:tc>
+        <w:tc>
+          <w:tcPr/>
+          <w:p>
+            <w:pPr>
+              <w:pStyle w:val="Compact"/>
+              <w:jc w:val="center"/>
+            </w:pPr>
+            <w:r>
+              <w:t xml:space="preserve">5</w:t>
+            </w:r>
+          </w:p>
+        </w:tc>
+      </w:tr>
+      <w:tr>
+        <w:tc>
+          <w:tcPr/>
+          <w:p>
+            <w:pPr>
+              <w:pStyle w:val="Compact"/>
+              <w:jc w:val="left"/>
+            </w:pPr>
+            <w:r>
+              <w:t xml:space="preserve">Low</w:t>
+            </w:r>
+          </w:p>
+        </w:tc>
+        <w:tc>
+          <w:tcPr/>
+          <w:p>
+            <w:pPr>
+              <w:pStyle w:val="Compact"/>
+              <w:jc w:val="left"/>
+            </w:pPr>
+            <w:r>
+              <w:t xml:space="preserve">West</w:t>
+            </w:r>
+          </w:p>
+        </w:tc>
+        <w:tc>
+          <w:tcPr/>
+          <w:p>
+            <w:pPr>
+              <w:pStyle w:val="Compact"/>
+              <w:jc w:val="center"/>
+            </w:pPr>
+            <w:r>
+              <w:t xml:space="preserve">7</w:t>
+            </w:r>
+          </w:p>
+        </w:tc>
+      </w:tr>
+    </w:tbl>
+    <w:bookmarkEnd w:id="58"/>
+    <w:bookmarkEnd w:id="59"/>
+    <w:bookmarkStart w:id="61" w:name="field-documentation"/>
+    <w:p>
+      <w:pPr>
+        <w:pStyle w:val="Titre1"/>
+      </w:pPr>
+      <w:r>
+        <w:t xml:space="preserve">8. Field Documentation</w:t>
+      </w:r>
+    </w:p>
+    <w:bookmarkStart w:id="60" w:name="field-documentation-images"/>
+    <w:p>
+      <w:pPr>
+        <w:pStyle w:val="Titre2"/>
+      </w:pPr>
+      <w:r>
+        <w:t xml:space="preserve">8.1 Field Documentation Images</w:t>
+      </w:r>
+    </w:p>
+    <w:p>
+      <w:pPr>
+        <w:pStyle w:val="FirstParagraph"/>
+      </w:pPr>
+      <w:r>
         <w:t xml:space="preserve">Pepperweed observations with field photos:</w:t>
       </w:r>
     </w:p>
@@ -1331,7 +4043,7 @@
         <w:t xml:space="preserve"> </w:t>
       </w:r>
       <w:r>
-        <w:t xml:space="preserve">200 plants</w:t>
+        <w:t xml:space="preserve">200+ (may be thousands)</w:t>
       </w:r>
     </w:p>
     <w:p>
@@ -1374,7 +4086,7 @@
         <w:t xml:space="preserve"> </w:t>
       </w:r>
       <w:r>
-        <w:t xml:space="preserve">200 plants</w:t>
+        <w:t xml:space="preserve">200+ (may be thousands)</w:t>
       </w:r>
     </w:p>
     <w:p>
@@ -1417,7 +4129,7 @@
         <w:t xml:space="preserve"> </w:t>
       </w:r>
       <w:r>
-        <w:t xml:space="preserve">200 plants</w:t>
+        <w:t xml:space="preserve">200+ (may be thousands)</w:t>
       </w:r>
     </w:p>
     <w:p>
@@ -1474,7 +4186,7 @@
         <w:t xml:space="preserve"> </w:t>
       </w:r>
       <w:r>
-        <w:t xml:space="preserve">200 plants</w:t>
+        <w:t xml:space="preserve">200+ (may be thousands)</w:t>
       </w:r>
     </w:p>
     <w:p>
@@ -1531,7 +4243,7 @@
         <w:t xml:space="preserve"> </w:t>
       </w:r>
       <w:r>
-        <w:t xml:space="preserve">200 plants</w:t>
+        <w:t xml:space="preserve">200+ (may be thousands)</w:t>
       </w:r>
     </w:p>
     <w:p>
@@ -1588,7 +4300,7 @@
         <w:t xml:space="preserve"> </w:t>
       </w:r>
       <w:r>
-        <w:t xml:space="preserve">200 plants</w:t>
+        <w:t xml:space="preserve">200+ (may be thousands)</w:t>
       </w:r>
     </w:p>
     <w:p>
@@ -1645,7 +4357,7 @@
         <w:t xml:space="preserve"> </w:t>
       </w:r>
       <w:r>
-        <w:t xml:space="preserve">200 plants</w:t>
+        <w:t xml:space="preserve">200+ (may be thousands)</w:t>
       </w:r>
     </w:p>
     <w:p>
@@ -1702,7 +4414,7 @@
         <w:t xml:space="preserve"> </w:t>
       </w:r>
       <w:r>
-        <w:t xml:space="preserve">200 plants</w:t>
+        <w:t xml:space="preserve">200+ (may be thousands)</w:t>
       </w:r>
     </w:p>
     <w:p>
@@ -1759,7 +4471,7 @@
         <w:t xml:space="preserve"> </w:t>
       </w:r>
       <w:r>
-        <w:t xml:space="preserve">200 plants</w:t>
+        <w:t xml:space="preserve">200+ (may be thousands)</w:t>
       </w:r>
     </w:p>
     <w:p>
@@ -1816,7 +4528,7 @@
         <w:t xml:space="preserve"> </w:t>
       </w:r>
       <w:r>
-        <w:t xml:space="preserve">200 plants</w:t>
+        <w:t xml:space="preserve">200+ (may be thousands)</w:t>
       </w:r>
     </w:p>
     <w:p>
@@ -1859,7 +4571,7 @@
         <w:t xml:space="preserve"> </w:t>
       </w:r>
       <w:r>
-        <w:t xml:space="preserve">200 plants</w:t>
+        <w:t xml:space="preserve">200+ (may be thousands)</w:t>
       </w:r>
     </w:p>
     <w:p>
@@ -1916,7 +4628,7 @@
         <w:t xml:space="preserve"> </w:t>
       </w:r>
       <w:r>
-        <w:t xml:space="preserve">200 plants</w:t>
+        <w:t xml:space="preserve">200+ (may be thousands)</w:t>
       </w:r>
     </w:p>
     <w:p>
@@ -1973,7 +4685,7 @@
         <w:t xml:space="preserve"> </w:t>
       </w:r>
       <w:r>
-        <w:t xml:space="preserve">200 plants</w:t>
+        <w:t xml:space="preserve">200+ (may be thousands)</w:t>
       </w:r>
     </w:p>
     <w:p>
@@ -2030,7 +4742,7 @@
         <w:t xml:space="preserve"> </w:t>
       </w:r>
       <w:r>
-        <w:t xml:space="preserve">200 plants</w:t>
+        <w:t xml:space="preserve">200+ (may be thousands)</w:t>
       </w:r>
     </w:p>
     <w:p>
@@ -2087,7 +4799,7 @@
         <w:t xml:space="preserve"> </w:t>
       </w:r>
       <w:r>
-        <w:t xml:space="preserve">200 plants</w:t>
+        <w:t xml:space="preserve">200+ (may be thousands)</w:t>
       </w:r>
     </w:p>
     <w:p>
@@ -2130,7 +4842,7 @@
         <w:t xml:space="preserve"> </w:t>
       </w:r>
       <w:r>
-        <w:t xml:space="preserve">200 plants</w:t>
+        <w:t xml:space="preserve">200+ (may be thousands)</w:t>
       </w:r>
     </w:p>
     <w:p>
@@ -2173,7 +4885,7 @@
         <w:t xml:space="preserve"> </w:t>
       </w:r>
       <w:r>
-        <w:t xml:space="preserve">200 plants</w:t>
+        <w:t xml:space="preserve">200+ (may be thousands)</w:t>
       </w:r>
     </w:p>
     <w:p>
@@ -2216,7 +4928,7 @@
         <w:t xml:space="preserve"> </w:t>
       </w:r>
       <w:r>
-        <w:t xml:space="preserve">200 plants</w:t>
+        <w:t xml:space="preserve">200+ (may be thousands)</w:t>
       </w:r>
     </w:p>
     <w:p>
@@ -2259,7 +4971,7 @@
         <w:t xml:space="preserve"> </w:t>
       </w:r>
       <w:r>
-        <w:t xml:space="preserve">200 plants</w:t>
+        <w:t xml:space="preserve">200+ (may be thousands)</w:t>
       </w:r>
     </w:p>
     <w:p>
@@ -2302,7 +5014,7 @@
         <w:t xml:space="preserve"> </w:t>
       </w:r>
       <w:r>
-        <w:t xml:space="preserve">200 plants</w:t>
+        <w:t xml:space="preserve">200+ (may be thousands)</w:t>
       </w:r>
     </w:p>
     <w:p>
@@ -2345,7 +5057,7 @@
         <w:t xml:space="preserve"> </w:t>
       </w:r>
       <w:r>
-        <w:t xml:space="preserve">200 plants</w:t>
+        <w:t xml:space="preserve">200+ (may be thousands)</w:t>
       </w:r>
     </w:p>
     <w:p>
@@ -2388,7 +5100,7 @@
         <w:t xml:space="preserve"> </w:t>
       </w:r>
       <w:r>
-        <w:t xml:space="preserve">200 plants</w:t>
+        <w:t xml:space="preserve">200+ (may be thousands)</w:t>
       </w:r>
     </w:p>
     <w:p>
@@ -2431,7 +5143,7 @@
         <w:t xml:space="preserve"> </w:t>
       </w:r>
       <w:r>
-        <w:t xml:space="preserve">200 plants</w:t>
+        <w:t xml:space="preserve">200+ (may be thousands)</w:t>
       </w:r>
     </w:p>
     <w:p>
@@ -2474,7 +5186,7 @@
         <w:t xml:space="preserve"> </w:t>
       </w:r>
       <w:r>
-        <w:t xml:space="preserve">200 plants</w:t>
+        <w:t xml:space="preserve">200+ (may be thousands)</w:t>
       </w:r>
     </w:p>
     <w:p>
@@ -2517,7 +5229,7 @@
         <w:t xml:space="preserve"> </w:t>
       </w:r>
       <w:r>
-        <w:t xml:space="preserve">200 plants</w:t>
+        <w:t xml:space="preserve">200+ (may be thousands)</w:t>
       </w:r>
     </w:p>
     <w:p>
@@ -2560,7 +5272,7 @@
         <w:t xml:space="preserve"> </w:t>
       </w:r>
       <w:r>
-        <w:t xml:space="preserve">200 plants</w:t>
+        <w:t xml:space="preserve">200+ (may be thousands)</w:t>
       </w:r>
     </w:p>
     <w:p>
@@ -2603,7 +5315,7 @@
         <w:t xml:space="preserve"> </w:t>
       </w:r>
       <w:r>
-        <w:t xml:space="preserve">200 plants</w:t>
+        <w:t xml:space="preserve">200+ (may be thousands)</w:t>
       </w:r>
     </w:p>
     <w:p>
@@ -2646,7 +5358,7 @@
         <w:t xml:space="preserve"> </w:t>
       </w:r>
       <w:r>
-        <w:t xml:space="preserve">200 plants</w:t>
+        <w:t xml:space="preserve">200+ (may be thousands)</w:t>
       </w:r>
     </w:p>
     <w:p>
@@ -2703,7 +5415,7 @@
         <w:t xml:space="preserve"> </w:t>
       </w:r>
       <w:r>
-        <w:t xml:space="preserve">200 plants</w:t>
+        <w:t xml:space="preserve">200+ (may be thousands)</w:t>
       </w:r>
     </w:p>
     <w:p>
@@ -2760,7 +5472,7 @@
         <w:t xml:space="preserve"> </w:t>
       </w:r>
       <w:r>
-        <w:t xml:space="preserve">200 plants</w:t>
+        <w:t xml:space="preserve">200+ (may be thousands)</w:t>
       </w:r>
     </w:p>
     <w:p>
@@ -2803,7 +5515,7 @@
         <w:t xml:space="preserve"> </w:t>
       </w:r>
       <w:r>
-        <w:t xml:space="preserve">100 plants</w:t>
+        <w:t xml:space="preserve">100</w:t>
       </w:r>
     </w:p>
     <w:p>
@@ -2818,15 +5530,15 @@
         <w:t xml:space="preserve">Field documentation images provide visual confirmation of pepperweed sites and help verify site characteristics.</w:t>
       </w:r>
     </w:p>
-    <w:bookmarkEnd w:id="48"/>
-    <w:bookmarkEnd w:id="49"/>
-    <w:bookmarkStart w:id="51" w:name="conclusion"/>
+    <w:bookmarkEnd w:id="60"/>
+    <w:bookmarkEnd w:id="61"/>
+    <w:bookmarkStart w:id="63" w:name="conclusion"/>
     <w:p>
       <w:pPr>
         <w:pStyle w:val="Titre1"/>
       </w:pPr>
       <w:r>
-        <w:t xml:space="preserve">7. Conclusion</w:t>
+        <w:t xml:space="preserve">9. Conclusion</w:t>
       </w:r>
     </w:p>
     <w:p>
@@ -2847,7 +5559,7 @@
       <w:r>
         <w:t xml:space="preserve"> </w:t>
       </w:r>
-      <w:hyperlink r:id="rId20">
+      <w:hyperlink r:id="rId21">
         <w:r>
           <w:rPr>
             <w:rStyle w:val="Hyperlink"/>
@@ -2856,13 +5568,13 @@
         </w:r>
       </w:hyperlink>
     </w:p>
-    <w:bookmarkStart w:id="50" w:name="data-disclaimer"/>
+    <w:bookmarkStart w:id="62" w:name="data-disclaimer"/>
     <w:p>
       <w:pPr>
         <w:pStyle w:val="Titre2"/>
       </w:pPr>
       <w:r>
-        <w:t xml:space="preserve">7.1 Data Disclaimer</w:t>
+        <w:t xml:space="preserve">9.1 Data Disclaimer</w:t>
       </w:r>
     </w:p>
     <w:p>
@@ -2910,8 +5622,8 @@
         <w:t xml:space="preserve">This analysis is automatically updated when new data is added to the ArcGIS feature service.</w:t>
       </w:r>
     </w:p>
-    <w:bookmarkEnd w:id="50"/>
-    <w:bookmarkEnd w:id="51"/>
+    <w:bookmarkEnd w:id="62"/>
+    <w:bookmarkEnd w:id="63"/>
     <w:sectPr>
       <w:type w:val="continuous"/>
       <w:pgSz w:h="16840" w:w="11900"/>

</xml_diff>